<commit_message>
feat: add and fill dto for CompareList #BKDO-1028
</commit_message>
<xml_diff>
--- a/src/Bk.APG.Api/Templates/InformationNote_French.docx
+++ b/src/Bk.APG.Api/Templates/InformationNote_French.docx
@@ -158,7 +158,7 @@
         <w:pStyle w:val="berschrift1"/>
         <w:numPr>
           <w:ilvl w:val="0"/>
-          <w:numId w:val="56"/>
+          <w:numId w:val="19"/>
         </w:numPr>
         <w:ind w:left="360" w:hanging="360"/>
         <w:rPr>
@@ -398,7 +398,7 @@
         <w:pStyle w:val="berschrift1"/>
         <w:numPr>
           <w:ilvl w:val="0"/>
-          <w:numId w:val="56"/>
+          <w:numId w:val="19"/>
         </w:numPr>
         <w:ind w:left="360" w:hanging="360"/>
       </w:pPr>
@@ -1238,7 +1238,7 @@
         <w:pStyle w:val="berschrift1"/>
         <w:numPr>
           <w:ilvl w:val="0"/>
-          <w:numId w:val="56"/>
+          <w:numId w:val="19"/>
         </w:numPr>
         <w:ind w:left="360" w:hanging="360"/>
       </w:pPr>
@@ -2101,7 +2101,7 @@
         <w:pStyle w:val="berschrift1"/>
         <w:numPr>
           <w:ilvl w:val="0"/>
-          <w:numId w:val="56"/>
+          <w:numId w:val="19"/>
         </w:numPr>
         <w:ind w:left="360" w:hanging="360"/>
       </w:pPr>
@@ -2496,7 +2496,19 @@
         <w:rPr>
           <w:rFonts w:cs="Arial"/>
         </w:rPr>
-        <w:t>understuffedFemaleCommittees</w:t>
+        <w:t>underst</w:t>
+      </w:r>
+      <w:r>
+        <w:rPr>
+          <w:rFonts w:cs="Arial"/>
+        </w:rPr>
+        <w:t>a</w:t>
+      </w:r>
+      <w:r>
+        <w:rPr>
+          <w:rFonts w:cs="Arial"/>
+        </w:rPr>
+        <w:t>ffedFemaleCommittees</w:t>
       </w:r>
       <w:r>
         <w:rPr>
@@ -2548,7 +2560,19 @@
         <w:rPr>
           <w:rFonts w:cs="Arial"/>
         </w:rPr>
-        <w:t>&lt;&lt;[informationNote.understuffedMaleCommittees]&gt;&gt;</w:t>
+        <w:t>&lt;&lt;[informationNote.underst</w:t>
+      </w:r>
+      <w:r>
+        <w:rPr>
+          <w:rFonts w:cs="Arial"/>
+        </w:rPr>
+        <w:t>a</w:t>
+      </w:r>
+      <w:r>
+        <w:rPr>
+          <w:rFonts w:cs="Arial"/>
+        </w:rPr>
+        <w:t>ffedMaleCommittees]&gt;&gt;</w:t>
       </w:r>
       <w:r>
         <w:rPr>
@@ -2576,7 +2600,19 @@
         <w:rPr>
           <w:rFonts w:cs="Arial"/>
         </w:rPr>
-        <w:t>&lt;&lt;[informationNote.heavyUnderstuffedFemaleCommittees]&gt;&gt;</w:t>
+        <w:t>&lt;&lt;[informationNote.heavyUnderst</w:t>
+      </w:r>
+      <w:r>
+        <w:rPr>
+          <w:rFonts w:cs="Arial"/>
+        </w:rPr>
+        <w:t>a</w:t>
+      </w:r>
+      <w:r>
+        <w:rPr>
+          <w:rFonts w:cs="Arial"/>
+        </w:rPr>
+        <w:t>ffedFemaleCommittees]&gt;&gt;</w:t>
       </w:r>
       <w:r>
         <w:rPr>
@@ -2589,7 +2625,19 @@
         <w:rPr>
           <w:rFonts w:cs="Arial"/>
         </w:rPr>
-        <w:t>&lt;&lt;[informationNote.heavyUnderstuffedFemaleCommittees]&gt;&gt;</w:t>
+        <w:t>&lt;&lt;[informationNote.heavyUnderst</w:t>
+      </w:r>
+      <w:r>
+        <w:rPr>
+          <w:rFonts w:cs="Arial"/>
+        </w:rPr>
+        <w:t>a</w:t>
+      </w:r>
+      <w:r>
+        <w:rPr>
+          <w:rFonts w:cs="Arial"/>
+        </w:rPr>
+        <w:t>ffedFemaleCommittees]&gt;&gt;</w:t>
       </w:r>
       <w:r>
         <w:rPr>
@@ -2928,7 +2976,19 @@
         <w:rPr>
           <w:rFonts w:cs="Arial"/>
         </w:rPr>
-        <w:t>previousHeavyUnderstuffedFemaleCommittees</w:t>
+        <w:t>previousHeavyUnderst</w:t>
+      </w:r>
+      <w:r>
+        <w:rPr>
+          <w:rFonts w:cs="Arial"/>
+        </w:rPr>
+        <w:t>a</w:t>
+      </w:r>
+      <w:r>
+        <w:rPr>
+          <w:rFonts w:cs="Arial"/>
+        </w:rPr>
+        <w:t>ffedFemaleCommittees</w:t>
       </w:r>
       <w:r>
         <w:rPr>
@@ -2978,7 +3038,19 @@
         <w:rPr>
           <w:rFonts w:cs="Arial"/>
         </w:rPr>
-        <w:t>previousHeavyUnderstuffedMaleCommittees</w:t>
+        <w:t>previousHeavyUnderst</w:t>
+      </w:r>
+      <w:r>
+        <w:rPr>
+          <w:rFonts w:cs="Arial"/>
+        </w:rPr>
+        <w:t>a</w:t>
+      </w:r>
+      <w:r>
+        <w:rPr>
+          <w:rFonts w:cs="Arial"/>
+        </w:rPr>
+        <w:t>ffedMaleCommittees</w:t>
       </w:r>
       <w:r>
         <w:rPr>
@@ -3078,7 +3150,7 @@
         <w:pStyle w:val="berschrift1"/>
         <w:numPr>
           <w:ilvl w:val="0"/>
-          <w:numId w:val="56"/>
+          <w:numId w:val="19"/>
         </w:numPr>
         <w:ind w:left="360" w:hanging="360"/>
       </w:pPr>
@@ -4205,7 +4277,7 @@
         <w:pStyle w:val="berschrift1"/>
         <w:numPr>
           <w:ilvl w:val="0"/>
-          <w:numId w:val="56"/>
+          <w:numId w:val="19"/>
         </w:numPr>
         <w:ind w:left="360" w:hanging="360"/>
       </w:pPr>
@@ -4415,7 +4487,7 @@
         <w:pStyle w:val="berschrift1"/>
         <w:numPr>
           <w:ilvl w:val="0"/>
-          <w:numId w:val="56"/>
+          <w:numId w:val="19"/>
         </w:numPr>
         <w:ind w:left="360" w:hanging="360"/>
       </w:pPr>
@@ -5824,7 +5896,21 @@
           <w:rFonts w:ascii="Arial" w:hAnsi="Arial" w:cs="Arial"/>
           <w:lang w:val="de-CH"/>
         </w:rPr>
-        <w:t>understuffedFemaleManagementCommittees</w:t>
+        <w:t>underst</w:t>
+      </w:r>
+      <w:r>
+        <w:rPr>
+          <w:rFonts w:ascii="Arial" w:hAnsi="Arial" w:cs="Arial"/>
+          <w:lang w:val="de-CH"/>
+        </w:rPr>
+        <w:t>a</w:t>
+      </w:r>
+      <w:r>
+        <w:rPr>
+          <w:rFonts w:ascii="Arial" w:hAnsi="Arial" w:cs="Arial"/>
+          <w:lang w:val="de-CH"/>
+        </w:rPr>
+        <w:t>ffedFemaleManagementCommittees</w:t>
       </w:r>
       <w:r>
         <w:rPr>
@@ -6144,7 +6230,21 @@
           <w:rFonts w:ascii="Arial" w:hAnsi="Arial" w:cs="Arial"/>
           <w:lang w:val="de-CH"/>
         </w:rPr>
-        <w:t>&lt;&lt;[informationNote.understuffedFemaleManagementCommittees]&gt;&gt;</w:t>
+        <w:t>&lt;&lt;[informationNote.underst</w:t>
+      </w:r>
+      <w:r>
+        <w:rPr>
+          <w:rFonts w:ascii="Arial" w:hAnsi="Arial" w:cs="Arial"/>
+          <w:lang w:val="de-CH"/>
+        </w:rPr>
+        <w:t>a</w:t>
+      </w:r>
+      <w:r>
+        <w:rPr>
+          <w:rFonts w:ascii="Arial" w:hAnsi="Arial" w:cs="Arial"/>
+          <w:lang w:val="de-CH"/>
+        </w:rPr>
+        <w:t>ffedFemaleManagementCommittees]&gt;&gt;</w:t>
       </w:r>
       <w:r>
         <w:rPr>
@@ -6165,7 +6265,21 @@
           <w:rFonts w:ascii="Arial" w:hAnsi="Arial" w:cs="Arial"/>
           <w:lang w:val="de-CH"/>
         </w:rPr>
-        <w:t>understuffedMaleManagementCommittees</w:t>
+        <w:t>underst</w:t>
+      </w:r>
+      <w:r>
+        <w:rPr>
+          <w:rFonts w:ascii="Arial" w:hAnsi="Arial" w:cs="Arial"/>
+          <w:lang w:val="de-CH"/>
+        </w:rPr>
+        <w:t>a</w:t>
+      </w:r>
+      <w:r>
+        <w:rPr>
+          <w:rFonts w:ascii="Arial" w:hAnsi="Arial" w:cs="Arial"/>
+          <w:lang w:val="de-CH"/>
+        </w:rPr>
+        <w:t>ffedMaleManagementCommittees</w:t>
       </w:r>
       <w:r>
         <w:rPr>
@@ -6200,7 +6314,7 @@
         <w:pStyle w:val="berschrift1"/>
         <w:numPr>
           <w:ilvl w:val="0"/>
-          <w:numId w:val="56"/>
+          <w:numId w:val="19"/>
         </w:numPr>
         <w:ind w:left="360" w:hanging="360"/>
         <w:rPr>
@@ -6850,7 +6964,7 @@
         <w:pStyle w:val="berschrift1"/>
         <w:numPr>
           <w:ilvl w:val="0"/>
-          <w:numId w:val="56"/>
+          <w:numId w:val="19"/>
         </w:numPr>
         <w:ind w:left="360" w:hanging="360"/>
       </w:pPr>
@@ -7311,7 +7425,7 @@
         <w:pStyle w:val="Listenabsatz"/>
         <w:numPr>
           <w:ilvl w:val="0"/>
-          <w:numId w:val="41"/>
+          <w:numId w:val="4"/>
         </w:numPr>
         <w:spacing w:before="60" w:after="40"/>
         <w:ind w:left="709" w:hanging="283"/>
@@ -7623,7 +7737,7 @@
         <w:pStyle w:val="Listenabsatz"/>
         <w:numPr>
           <w:ilvl w:val="0"/>
-          <w:numId w:val="41"/>
+          <w:numId w:val="4"/>
         </w:numPr>
         <w:spacing w:before="60" w:after="40"/>
         <w:ind w:left="709" w:hanging="283"/>
@@ -7801,7 +7915,23 @@
           <w:highlight w:val="green"/>
           <w:lang w:val="en-US"/>
         </w:rPr>
-        <w:t>genderUnderstuffedCommitteesByDepartmentAndType</w:t>
+        <w:t>genderUnderst</w:t>
+      </w:r>
+      <w:r>
+        <w:rPr>
+          <w:rFonts w:cs="Arial"/>
+          <w:highlight w:val="green"/>
+          <w:lang w:val="en-US"/>
+        </w:rPr>
+        <w:t>a</w:t>
+      </w:r>
+      <w:r>
+        <w:rPr>
+          <w:rFonts w:cs="Arial"/>
+          <w:highlight w:val="green"/>
+          <w:lang w:val="en-US"/>
+        </w:rPr>
+        <w:t>ffedCommitteesByDepartmentAndType</w:t>
       </w:r>
       <w:r>
         <w:rPr>
@@ -7917,7 +8047,7 @@
         <w:pStyle w:val="Listenabsatz"/>
         <w:numPr>
           <w:ilvl w:val="0"/>
-          <w:numId w:val="41"/>
+          <w:numId w:val="4"/>
         </w:numPr>
         <w:spacing w:before="60" w:after="40"/>
         <w:ind w:left="709" w:hanging="283"/>
@@ -8046,7 +8176,23 @@
           <w:highlight w:val="green"/>
           <w:lang w:val="en-US"/>
         </w:rPr>
-        <w:t>languageUnderstuffedCommitteesByDepartmentAndType</w:t>
+        <w:t>languageUnderst</w:t>
+      </w:r>
+      <w:r>
+        <w:rPr>
+          <w:rFonts w:cs="Arial"/>
+          <w:highlight w:val="green"/>
+          <w:lang w:val="en-US"/>
+        </w:rPr>
+        <w:t>a</w:t>
+      </w:r>
+      <w:r>
+        <w:rPr>
+          <w:rFonts w:cs="Arial"/>
+          <w:highlight w:val="green"/>
+          <w:lang w:val="en-US"/>
+        </w:rPr>
+        <w:t>ffedCommitteesByDepartmentAndType</w:t>
       </w:r>
       <w:r>
         <w:rPr>
@@ -8162,7 +8308,7 @@
         <w:pStyle w:val="Listenabsatz"/>
         <w:numPr>
           <w:ilvl w:val="0"/>
-          <w:numId w:val="41"/>
+          <w:numId w:val="4"/>
         </w:numPr>
         <w:spacing w:before="60" w:after="40"/>
         <w:ind w:left="709" w:hanging="283"/>
@@ -8384,7 +8530,7 @@
         <w:pStyle w:val="Listenabsatz"/>
         <w:numPr>
           <w:ilvl w:val="0"/>
-          <w:numId w:val="41"/>
+          <w:numId w:val="4"/>
         </w:numPr>
         <w:spacing w:before="60" w:after="40"/>
         <w:ind w:left="709" w:hanging="283"/>
@@ -8501,7 +8647,7 @@
         <w:pStyle w:val="Listenabsatz"/>
         <w:numPr>
           <w:ilvl w:val="0"/>
-          <w:numId w:val="66"/>
+          <w:numId w:val="20"/>
         </w:numPr>
         <w:spacing w:before="120" w:after="120"/>
         <w:ind w:left="426" w:hanging="426"/>
@@ -8721,7 +8867,7 @@
         <w:pStyle w:val="Listenabsatz"/>
         <w:numPr>
           <w:ilvl w:val="0"/>
-          <w:numId w:val="66"/>
+          <w:numId w:val="20"/>
         </w:numPr>
         <w:ind w:left="426" w:hanging="426"/>
         <w:rPr>
@@ -8908,7 +9054,7 @@
         <w:pStyle w:val="Listenabsatz"/>
         <w:numPr>
           <w:ilvl w:val="0"/>
-          <w:numId w:val="41"/>
+          <w:numId w:val="4"/>
         </w:numPr>
         <w:spacing w:before="60" w:after="40"/>
         <w:ind w:left="709" w:hanging="283"/>
@@ -11012,37 +11158,19 @@
 <file path=word/numbering.xml><?xml version="1.0" encoding="utf-8"?>
 <w:numbering xmlns:wpc="http://schemas.microsoft.com/office/word/2010/wordprocessingCanvas" xmlns:cx="http://schemas.microsoft.com/office/drawing/2014/chartex" xmlns:cx1="http://schemas.microsoft.com/office/drawing/2015/9/8/chartex" xmlns:cx2="http://schemas.microsoft.com/office/drawing/2015/10/21/chartex" xmlns:cx3="http://schemas.microsoft.com/office/drawing/2016/5/9/chartex" xmlns:cx4="http://schemas.microsoft.com/office/drawing/2016/5/10/chartex" xmlns:cx5="http://schemas.microsoft.com/office/drawing/2016/5/11/chartex" xmlns:cx6="http://schemas.microsoft.com/office/drawing/2016/5/12/chartex" xmlns:cx7="http://schemas.microsoft.com/office/drawing/2016/5/13/chartex" xmlns:cx8="http://schemas.microsoft.com/office/drawing/2016/5/14/chartex" xmlns:mc="http://schemas.openxmlformats.org/markup-compatibility/2006" xmlns:aink="http://schemas.microsoft.com/office/drawing/2016/ink" xmlns:am3d="http://schemas.microsoft.com/office/drawing/2017/model3d" xmlns:o="urn:schemas-microsoft-com:office:office" xmlns:oel="http://schemas.microsoft.com/office/2019/extlst" xmlns:r="http://schemas.openxmlformats.org/officeDocument/2006/relationships" xmlns:m="http://schemas.openxmlformats.org/officeDocument/2006/math" xmlns:v="urn:schemas-microsoft-com:vml" xmlns:wp14="http://schemas.microsoft.com/office/word/2010/wordprocessingDrawing" xmlns:wp="http://schemas.openxmlformats.org/drawingml/2006/wordprocessingDrawing" xmlns:w10="urn:schemas-microsoft-com:office:word" xmlns:w="http://schemas.openxmlformats.org/wordprocessingml/2006/main" xmlns:w14="http://schemas.microsoft.com/office/word/2010/wordml" xmlns:w15="http://schemas.microsoft.com/office/word/2012/wordml" xmlns:w16cex="http://schemas.microsoft.com/office/word/2018/wordml/cex" xmlns:w16cid="http://schemas.microsoft.com/office/word/2016/wordml/cid" xmlns:w16="http://schemas.microsoft.com/office/word/2018/wordml" xmlns:w16du="http://schemas.microsoft.com/office/word/2023/wordml/word16du" xmlns:w16sdtdh="http://schemas.microsoft.com/office/word/2020/wordml/sdtdatahash" xmlns:w16sdtfl="http://schemas.microsoft.com/office/word/2024/wordml/sdtformatlock" xmlns:w16se="http://schemas.microsoft.com/office/word/2015/wordml/symex" xmlns:wpg="http://schemas.microsoft.com/office/word/2010/wordprocessingGroup" xmlns:wpi="http://schemas.microsoft.com/office/word/2010/wordprocessingInk" xmlns:wne="http://schemas.microsoft.com/office/word/2006/wordml" xmlns:wps="http://schemas.microsoft.com/office/word/2010/wordprocessingShape" mc:Ignorable="w14 w15 w16se w16cid w16 w16cex w16sdtdh w16sdtfl w16du wp14">
   <w:abstractNum w:abstractNumId="0" w15:restartNumberingAfterBreak="0">
-    <w:nsid w:val="02662F3E"/>
+    <w:nsid w:val="045279DA"/>
     <w:multiLevelType w:val="hybridMultilevel"/>
-    <w:tmpl w:val="405EDA0E"/>
-    <w:lvl w:ilvl="0" w:tplc="9C805624">
+    <w:tmpl w:val="E1EE1E3E"/>
+    <w:lvl w:ilvl="0" w:tplc="B75CBDB8">
       <w:start w:val="1"/>
       <w:numFmt w:val="bullet"/>
-      <w:lvlText w:val="-"/>
+      <w:lvlText w:val=""/>
       <w:lvlJc w:val="left"/>
       <w:pPr>
         <w:ind w:left="360" w:hanging="360"/>
       </w:pPr>
       <w:rPr>
-        <w:rFonts w:ascii="Arial" w:hAnsi="Arial" w:hint="default"/>
-        <w:b w:val="0"/>
-        <w:i w:val="0"/>
-        <w:caps w:val="0"/>
-        <w:strike w:val="0"/>
-        <w:dstrike w:val="0"/>
-        <w:vanish w:val="0"/>
-        <w:color w:val="000000"/>
-        <w:sz w:val="20"/>
-        <w:szCs w:val="20"/>
-        <w:vertAlign w:val="baseline"/>
-        <w14:shadow w14:blurRad="0" w14:dist="0" w14:dir="0" w14:sx="0" w14:sy="0" w14:kx="0" w14:ky="0" w14:algn="none">
-          <w14:srgbClr w14:val="000000"/>
-        </w14:shadow>
-        <w14:textOutline w14:w="0" w14:cap="rnd" w14:cmpd="sng" w14:algn="ctr">
-          <w14:noFill/>
-          <w14:prstDash w14:val="solid"/>
-          <w14:bevel/>
-        </w14:textOutline>
+        <w:rFonts w:ascii="Symbol" w:hAnsi="Symbol" w:hint="default"/>
       </w:rPr>
     </w:lvl>
     <w:lvl w:ilvl="1" w:tplc="100C0003" w:tentative="1">
@@ -11143,406 +11271,6 @@
     </w:lvl>
   </w:abstractNum>
   <w:abstractNum w:abstractNumId="1" w15:restartNumberingAfterBreak="0">
-    <w:nsid w:val="03B43D9C"/>
-    <w:multiLevelType w:val="multilevel"/>
-    <w:tmpl w:val="0807001F"/>
-    <w:lvl w:ilvl="0">
-      <w:start w:val="1"/>
-      <w:numFmt w:val="decimal"/>
-      <w:lvlText w:val="%1."/>
-      <w:lvlJc w:val="left"/>
-      <w:pPr>
-        <w:ind w:left="360" w:hanging="360"/>
-      </w:pPr>
-    </w:lvl>
-    <w:lvl w:ilvl="1">
-      <w:start w:val="1"/>
-      <w:numFmt w:val="decimal"/>
-      <w:lvlText w:val="%1.%2."/>
-      <w:lvlJc w:val="left"/>
-      <w:pPr>
-        <w:ind w:left="792" w:hanging="432"/>
-      </w:pPr>
-    </w:lvl>
-    <w:lvl w:ilvl="2">
-      <w:start w:val="1"/>
-      <w:numFmt w:val="decimal"/>
-      <w:lvlText w:val="%1.%2.%3."/>
-      <w:lvlJc w:val="left"/>
-      <w:pPr>
-        <w:ind w:left="1224" w:hanging="504"/>
-      </w:pPr>
-    </w:lvl>
-    <w:lvl w:ilvl="3">
-      <w:start w:val="1"/>
-      <w:numFmt w:val="decimal"/>
-      <w:lvlText w:val="%1.%2.%3.%4."/>
-      <w:lvlJc w:val="left"/>
-      <w:pPr>
-        <w:ind w:left="1728" w:hanging="648"/>
-      </w:pPr>
-    </w:lvl>
-    <w:lvl w:ilvl="4">
-      <w:start w:val="1"/>
-      <w:numFmt w:val="decimal"/>
-      <w:lvlText w:val="%1.%2.%3.%4.%5."/>
-      <w:lvlJc w:val="left"/>
-      <w:pPr>
-        <w:ind w:left="2232" w:hanging="792"/>
-      </w:pPr>
-    </w:lvl>
-    <w:lvl w:ilvl="5">
-      <w:start w:val="1"/>
-      <w:numFmt w:val="decimal"/>
-      <w:lvlText w:val="%1.%2.%3.%4.%5.%6."/>
-      <w:lvlJc w:val="left"/>
-      <w:pPr>
-        <w:ind w:left="2736" w:hanging="936"/>
-      </w:pPr>
-    </w:lvl>
-    <w:lvl w:ilvl="6">
-      <w:start w:val="1"/>
-      <w:numFmt w:val="decimal"/>
-      <w:lvlText w:val="%1.%2.%3.%4.%5.%6.%7."/>
-      <w:lvlJc w:val="left"/>
-      <w:pPr>
-        <w:ind w:left="3240" w:hanging="1080"/>
-      </w:pPr>
-    </w:lvl>
-    <w:lvl w:ilvl="7">
-      <w:start w:val="1"/>
-      <w:numFmt w:val="decimal"/>
-      <w:lvlText w:val="%1.%2.%3.%4.%5.%6.%7.%8."/>
-      <w:lvlJc w:val="left"/>
-      <w:pPr>
-        <w:ind w:left="3744" w:hanging="1224"/>
-      </w:pPr>
-    </w:lvl>
-    <w:lvl w:ilvl="8">
-      <w:start w:val="1"/>
-      <w:numFmt w:val="decimal"/>
-      <w:lvlText w:val="%1.%2.%3.%4.%5.%6.%7.%8.%9."/>
-      <w:lvlJc w:val="left"/>
-      <w:pPr>
-        <w:ind w:left="4320" w:hanging="1440"/>
-      </w:pPr>
-    </w:lvl>
-  </w:abstractNum>
-  <w:abstractNum w:abstractNumId="2" w15:restartNumberingAfterBreak="0">
-    <w:nsid w:val="045279DA"/>
-    <w:multiLevelType w:val="hybridMultilevel"/>
-    <w:tmpl w:val="E1EE1E3E"/>
-    <w:lvl w:ilvl="0" w:tplc="B75CBDB8">
-      <w:start w:val="1"/>
-      <w:numFmt w:val="bullet"/>
-      <w:lvlText w:val=""/>
-      <w:lvlJc w:val="left"/>
-      <w:pPr>
-        <w:ind w:left="360" w:hanging="360"/>
-      </w:pPr>
-      <w:rPr>
-        <w:rFonts w:ascii="Symbol" w:hAnsi="Symbol" w:hint="default"/>
-      </w:rPr>
-    </w:lvl>
-    <w:lvl w:ilvl="1" w:tplc="100C0003" w:tentative="1">
-      <w:start w:val="1"/>
-      <w:numFmt w:val="bullet"/>
-      <w:lvlText w:val="o"/>
-      <w:lvlJc w:val="left"/>
-      <w:pPr>
-        <w:ind w:left="1080" w:hanging="360"/>
-      </w:pPr>
-      <w:rPr>
-        <w:rFonts w:ascii="Courier New" w:hAnsi="Courier New" w:cs="Courier New" w:hint="default"/>
-      </w:rPr>
-    </w:lvl>
-    <w:lvl w:ilvl="2" w:tplc="100C0005" w:tentative="1">
-      <w:start w:val="1"/>
-      <w:numFmt w:val="bullet"/>
-      <w:lvlText w:val=""/>
-      <w:lvlJc w:val="left"/>
-      <w:pPr>
-        <w:ind w:left="1800" w:hanging="360"/>
-      </w:pPr>
-      <w:rPr>
-        <w:rFonts w:ascii="Wingdings" w:hAnsi="Wingdings" w:hint="default"/>
-      </w:rPr>
-    </w:lvl>
-    <w:lvl w:ilvl="3" w:tplc="100C0001" w:tentative="1">
-      <w:start w:val="1"/>
-      <w:numFmt w:val="bullet"/>
-      <w:lvlText w:val=""/>
-      <w:lvlJc w:val="left"/>
-      <w:pPr>
-        <w:ind w:left="2520" w:hanging="360"/>
-      </w:pPr>
-      <w:rPr>
-        <w:rFonts w:ascii="Symbol" w:hAnsi="Symbol" w:hint="default"/>
-      </w:rPr>
-    </w:lvl>
-    <w:lvl w:ilvl="4" w:tplc="100C0003" w:tentative="1">
-      <w:start w:val="1"/>
-      <w:numFmt w:val="bullet"/>
-      <w:lvlText w:val="o"/>
-      <w:lvlJc w:val="left"/>
-      <w:pPr>
-        <w:ind w:left="3240" w:hanging="360"/>
-      </w:pPr>
-      <w:rPr>
-        <w:rFonts w:ascii="Courier New" w:hAnsi="Courier New" w:cs="Courier New" w:hint="default"/>
-      </w:rPr>
-    </w:lvl>
-    <w:lvl w:ilvl="5" w:tplc="100C0005" w:tentative="1">
-      <w:start w:val="1"/>
-      <w:numFmt w:val="bullet"/>
-      <w:lvlText w:val=""/>
-      <w:lvlJc w:val="left"/>
-      <w:pPr>
-        <w:ind w:left="3960" w:hanging="360"/>
-      </w:pPr>
-      <w:rPr>
-        <w:rFonts w:ascii="Wingdings" w:hAnsi="Wingdings" w:hint="default"/>
-      </w:rPr>
-    </w:lvl>
-    <w:lvl w:ilvl="6" w:tplc="100C0001" w:tentative="1">
-      <w:start w:val="1"/>
-      <w:numFmt w:val="bullet"/>
-      <w:lvlText w:val=""/>
-      <w:lvlJc w:val="left"/>
-      <w:pPr>
-        <w:ind w:left="4680" w:hanging="360"/>
-      </w:pPr>
-      <w:rPr>
-        <w:rFonts w:ascii="Symbol" w:hAnsi="Symbol" w:hint="default"/>
-      </w:rPr>
-    </w:lvl>
-    <w:lvl w:ilvl="7" w:tplc="100C0003" w:tentative="1">
-      <w:start w:val="1"/>
-      <w:numFmt w:val="bullet"/>
-      <w:lvlText w:val="o"/>
-      <w:lvlJc w:val="left"/>
-      <w:pPr>
-        <w:ind w:left="5400" w:hanging="360"/>
-      </w:pPr>
-      <w:rPr>
-        <w:rFonts w:ascii="Courier New" w:hAnsi="Courier New" w:cs="Courier New" w:hint="default"/>
-      </w:rPr>
-    </w:lvl>
-    <w:lvl w:ilvl="8" w:tplc="100C0005" w:tentative="1">
-      <w:start w:val="1"/>
-      <w:numFmt w:val="bullet"/>
-      <w:lvlText w:val=""/>
-      <w:lvlJc w:val="left"/>
-      <w:pPr>
-        <w:ind w:left="6120" w:hanging="360"/>
-      </w:pPr>
-      <w:rPr>
-        <w:rFonts w:ascii="Wingdings" w:hAnsi="Wingdings" w:hint="default"/>
-      </w:rPr>
-    </w:lvl>
-  </w:abstractNum>
-  <w:abstractNum w:abstractNumId="3" w15:restartNumberingAfterBreak="0">
-    <w:nsid w:val="053B4BCF"/>
-    <w:multiLevelType w:val="hybridMultilevel"/>
-    <w:tmpl w:val="26B42782"/>
-    <w:lvl w:ilvl="0" w:tplc="917A8990">
-      <w:numFmt w:val="bullet"/>
-      <w:lvlText w:val="-"/>
-      <w:lvlJc w:val="left"/>
-      <w:pPr>
-        <w:ind w:left="720" w:hanging="360"/>
-      </w:pPr>
-      <w:rPr>
-        <w:rFonts w:ascii="Arial" w:eastAsiaTheme="minorHAnsi" w:hAnsi="Arial" w:cs="Arial" w:hint="default"/>
-      </w:rPr>
-    </w:lvl>
-    <w:lvl w:ilvl="1" w:tplc="100C0003" w:tentative="1">
-      <w:start w:val="1"/>
-      <w:numFmt w:val="bullet"/>
-      <w:lvlText w:val="o"/>
-      <w:lvlJc w:val="left"/>
-      <w:pPr>
-        <w:ind w:left="1440" w:hanging="360"/>
-      </w:pPr>
-      <w:rPr>
-        <w:rFonts w:ascii="Courier New" w:hAnsi="Courier New" w:cs="Courier New" w:hint="default"/>
-      </w:rPr>
-    </w:lvl>
-    <w:lvl w:ilvl="2" w:tplc="100C0005" w:tentative="1">
-      <w:start w:val="1"/>
-      <w:numFmt w:val="bullet"/>
-      <w:lvlText w:val=""/>
-      <w:lvlJc w:val="left"/>
-      <w:pPr>
-        <w:ind w:left="2160" w:hanging="360"/>
-      </w:pPr>
-      <w:rPr>
-        <w:rFonts w:ascii="Wingdings" w:hAnsi="Wingdings" w:hint="default"/>
-      </w:rPr>
-    </w:lvl>
-    <w:lvl w:ilvl="3" w:tplc="100C0001" w:tentative="1">
-      <w:start w:val="1"/>
-      <w:numFmt w:val="bullet"/>
-      <w:lvlText w:val=""/>
-      <w:lvlJc w:val="left"/>
-      <w:pPr>
-        <w:ind w:left="2880" w:hanging="360"/>
-      </w:pPr>
-      <w:rPr>
-        <w:rFonts w:ascii="Symbol" w:hAnsi="Symbol" w:hint="default"/>
-      </w:rPr>
-    </w:lvl>
-    <w:lvl w:ilvl="4" w:tplc="100C0003" w:tentative="1">
-      <w:start w:val="1"/>
-      <w:numFmt w:val="bullet"/>
-      <w:lvlText w:val="o"/>
-      <w:lvlJc w:val="left"/>
-      <w:pPr>
-        <w:ind w:left="3600" w:hanging="360"/>
-      </w:pPr>
-      <w:rPr>
-        <w:rFonts w:ascii="Courier New" w:hAnsi="Courier New" w:cs="Courier New" w:hint="default"/>
-      </w:rPr>
-    </w:lvl>
-    <w:lvl w:ilvl="5" w:tplc="100C0005" w:tentative="1">
-      <w:start w:val="1"/>
-      <w:numFmt w:val="bullet"/>
-      <w:lvlText w:val=""/>
-      <w:lvlJc w:val="left"/>
-      <w:pPr>
-        <w:ind w:left="4320" w:hanging="360"/>
-      </w:pPr>
-      <w:rPr>
-        <w:rFonts w:ascii="Wingdings" w:hAnsi="Wingdings" w:hint="default"/>
-      </w:rPr>
-    </w:lvl>
-    <w:lvl w:ilvl="6" w:tplc="100C0001" w:tentative="1">
-      <w:start w:val="1"/>
-      <w:numFmt w:val="bullet"/>
-      <w:lvlText w:val=""/>
-      <w:lvlJc w:val="left"/>
-      <w:pPr>
-        <w:ind w:left="5040" w:hanging="360"/>
-      </w:pPr>
-      <w:rPr>
-        <w:rFonts w:ascii="Symbol" w:hAnsi="Symbol" w:hint="default"/>
-      </w:rPr>
-    </w:lvl>
-    <w:lvl w:ilvl="7" w:tplc="100C0003" w:tentative="1">
-      <w:start w:val="1"/>
-      <w:numFmt w:val="bullet"/>
-      <w:lvlText w:val="o"/>
-      <w:lvlJc w:val="left"/>
-      <w:pPr>
-        <w:ind w:left="5760" w:hanging="360"/>
-      </w:pPr>
-      <w:rPr>
-        <w:rFonts w:ascii="Courier New" w:hAnsi="Courier New" w:cs="Courier New" w:hint="default"/>
-      </w:rPr>
-    </w:lvl>
-    <w:lvl w:ilvl="8" w:tplc="100C0005" w:tentative="1">
-      <w:start w:val="1"/>
-      <w:numFmt w:val="bullet"/>
-      <w:lvlText w:val=""/>
-      <w:lvlJc w:val="left"/>
-      <w:pPr>
-        <w:ind w:left="6480" w:hanging="360"/>
-      </w:pPr>
-      <w:rPr>
-        <w:rFonts w:ascii="Wingdings" w:hAnsi="Wingdings" w:hint="default"/>
-      </w:rPr>
-    </w:lvl>
-  </w:abstractNum>
-  <w:abstractNum w:abstractNumId="4" w15:restartNumberingAfterBreak="0">
-    <w:nsid w:val="062D107C"/>
-    <w:multiLevelType w:val="hybridMultilevel"/>
-    <w:tmpl w:val="E9C4C9BE"/>
-    <w:lvl w:ilvl="0" w:tplc="100C000F">
-      <w:start w:val="1"/>
-      <w:numFmt w:val="decimal"/>
-      <w:lvlText w:val="%1."/>
-      <w:lvlJc w:val="left"/>
-      <w:pPr>
-        <w:ind w:left="720" w:hanging="360"/>
-      </w:pPr>
-      <w:rPr>
-        <w:rFonts w:hint="default"/>
-      </w:rPr>
-    </w:lvl>
-    <w:lvl w:ilvl="1" w:tplc="100C0019" w:tentative="1">
-      <w:start w:val="1"/>
-      <w:numFmt w:val="lowerLetter"/>
-      <w:lvlText w:val="%2."/>
-      <w:lvlJc w:val="left"/>
-      <w:pPr>
-        <w:ind w:left="1440" w:hanging="360"/>
-      </w:pPr>
-    </w:lvl>
-    <w:lvl w:ilvl="2" w:tplc="100C001B" w:tentative="1">
-      <w:start w:val="1"/>
-      <w:numFmt w:val="lowerRoman"/>
-      <w:lvlText w:val="%3."/>
-      <w:lvlJc w:val="right"/>
-      <w:pPr>
-        <w:ind w:left="2160" w:hanging="180"/>
-      </w:pPr>
-    </w:lvl>
-    <w:lvl w:ilvl="3" w:tplc="100C000F" w:tentative="1">
-      <w:start w:val="1"/>
-      <w:numFmt w:val="decimal"/>
-      <w:lvlText w:val="%4."/>
-      <w:lvlJc w:val="left"/>
-      <w:pPr>
-        <w:ind w:left="2880" w:hanging="360"/>
-      </w:pPr>
-    </w:lvl>
-    <w:lvl w:ilvl="4" w:tplc="100C0019" w:tentative="1">
-      <w:start w:val="1"/>
-      <w:numFmt w:val="lowerLetter"/>
-      <w:lvlText w:val="%5."/>
-      <w:lvlJc w:val="left"/>
-      <w:pPr>
-        <w:ind w:left="3600" w:hanging="360"/>
-      </w:pPr>
-    </w:lvl>
-    <w:lvl w:ilvl="5" w:tplc="100C001B" w:tentative="1">
-      <w:start w:val="1"/>
-      <w:numFmt w:val="lowerRoman"/>
-      <w:lvlText w:val="%6."/>
-      <w:lvlJc w:val="right"/>
-      <w:pPr>
-        <w:ind w:left="4320" w:hanging="180"/>
-      </w:pPr>
-    </w:lvl>
-    <w:lvl w:ilvl="6" w:tplc="100C000F" w:tentative="1">
-      <w:start w:val="1"/>
-      <w:numFmt w:val="decimal"/>
-      <w:lvlText w:val="%7."/>
-      <w:lvlJc w:val="left"/>
-      <w:pPr>
-        <w:ind w:left="5040" w:hanging="360"/>
-      </w:pPr>
-    </w:lvl>
-    <w:lvl w:ilvl="7" w:tplc="100C0019" w:tentative="1">
-      <w:start w:val="1"/>
-      <w:numFmt w:val="lowerLetter"/>
-      <w:lvlText w:val="%8."/>
-      <w:lvlJc w:val="left"/>
-      <w:pPr>
-        <w:ind w:left="5760" w:hanging="360"/>
-      </w:pPr>
-    </w:lvl>
-    <w:lvl w:ilvl="8" w:tplc="100C001B" w:tentative="1">
-      <w:start w:val="1"/>
-      <w:numFmt w:val="lowerRoman"/>
-      <w:lvlText w:val="%9."/>
-      <w:lvlJc w:val="right"/>
-      <w:pPr>
-        <w:ind w:left="6480" w:hanging="180"/>
-      </w:pPr>
-    </w:lvl>
-  </w:abstractNum>
-  <w:abstractNum w:abstractNumId="5" w15:restartNumberingAfterBreak="0">
     <w:nsid w:val="06CF726B"/>
     <w:multiLevelType w:val="hybridMultilevel"/>
     <w:tmpl w:val="8814F874"/>
@@ -11673,272 +11401,7 @@
       </w:rPr>
     </w:lvl>
   </w:abstractNum>
-  <w:abstractNum w:abstractNumId="6" w15:restartNumberingAfterBreak="0">
-    <w:nsid w:val="0F26687C"/>
-    <w:multiLevelType w:val="hybridMultilevel"/>
-    <w:tmpl w:val="99946688"/>
-    <w:lvl w:ilvl="0" w:tplc="08070017">
-      <w:start w:val="1"/>
-      <w:numFmt w:val="lowerLetter"/>
-      <w:lvlText w:val="%1)"/>
-      <w:lvlJc w:val="left"/>
-      <w:pPr>
-        <w:ind w:left="720" w:hanging="360"/>
-      </w:pPr>
-      <w:rPr>
-        <w:rFonts w:hint="default"/>
-      </w:rPr>
-    </w:lvl>
-    <w:lvl w:ilvl="1" w:tplc="08070019" w:tentative="1">
-      <w:start w:val="1"/>
-      <w:numFmt w:val="lowerLetter"/>
-      <w:lvlText w:val="%2."/>
-      <w:lvlJc w:val="left"/>
-      <w:pPr>
-        <w:ind w:left="1440" w:hanging="360"/>
-      </w:pPr>
-    </w:lvl>
-    <w:lvl w:ilvl="2" w:tplc="0807001B" w:tentative="1">
-      <w:start w:val="1"/>
-      <w:numFmt w:val="lowerRoman"/>
-      <w:lvlText w:val="%3."/>
-      <w:lvlJc w:val="right"/>
-      <w:pPr>
-        <w:ind w:left="2160" w:hanging="180"/>
-      </w:pPr>
-    </w:lvl>
-    <w:lvl w:ilvl="3" w:tplc="0807000F" w:tentative="1">
-      <w:start w:val="1"/>
-      <w:numFmt w:val="decimal"/>
-      <w:lvlText w:val="%4."/>
-      <w:lvlJc w:val="left"/>
-      <w:pPr>
-        <w:ind w:left="2880" w:hanging="360"/>
-      </w:pPr>
-    </w:lvl>
-    <w:lvl w:ilvl="4" w:tplc="08070019" w:tentative="1">
-      <w:start w:val="1"/>
-      <w:numFmt w:val="lowerLetter"/>
-      <w:lvlText w:val="%5."/>
-      <w:lvlJc w:val="left"/>
-      <w:pPr>
-        <w:ind w:left="3600" w:hanging="360"/>
-      </w:pPr>
-    </w:lvl>
-    <w:lvl w:ilvl="5" w:tplc="0807001B" w:tentative="1">
-      <w:start w:val="1"/>
-      <w:numFmt w:val="lowerRoman"/>
-      <w:lvlText w:val="%6."/>
-      <w:lvlJc w:val="right"/>
-      <w:pPr>
-        <w:ind w:left="4320" w:hanging="180"/>
-      </w:pPr>
-    </w:lvl>
-    <w:lvl w:ilvl="6" w:tplc="0807000F" w:tentative="1">
-      <w:start w:val="1"/>
-      <w:numFmt w:val="decimal"/>
-      <w:lvlText w:val="%7."/>
-      <w:lvlJc w:val="left"/>
-      <w:pPr>
-        <w:ind w:left="5040" w:hanging="360"/>
-      </w:pPr>
-    </w:lvl>
-    <w:lvl w:ilvl="7" w:tplc="08070019" w:tentative="1">
-      <w:start w:val="1"/>
-      <w:numFmt w:val="lowerLetter"/>
-      <w:lvlText w:val="%8."/>
-      <w:lvlJc w:val="left"/>
-      <w:pPr>
-        <w:ind w:left="5760" w:hanging="360"/>
-      </w:pPr>
-    </w:lvl>
-    <w:lvl w:ilvl="8" w:tplc="0807001B" w:tentative="1">
-      <w:start w:val="1"/>
-      <w:numFmt w:val="lowerRoman"/>
-      <w:lvlText w:val="%9."/>
-      <w:lvlJc w:val="right"/>
-      <w:pPr>
-        <w:ind w:left="6480" w:hanging="180"/>
-      </w:pPr>
-    </w:lvl>
-  </w:abstractNum>
-  <w:abstractNum w:abstractNumId="7" w15:restartNumberingAfterBreak="0">
-    <w:nsid w:val="10320E89"/>
-    <w:multiLevelType w:val="hybridMultilevel"/>
-    <w:tmpl w:val="F496E3A2"/>
-    <w:lvl w:ilvl="0" w:tplc="557A92E6">
-      <w:start w:val="1"/>
-      <w:numFmt w:val="decimal"/>
-      <w:lvlText w:val="%1."/>
-      <w:lvlJc w:val="left"/>
-      <w:pPr>
-        <w:ind w:left="720" w:hanging="360"/>
-      </w:pPr>
-      <w:rPr>
-        <w:b w:val="0"/>
-        <w:bCs/>
-      </w:rPr>
-    </w:lvl>
-    <w:lvl w:ilvl="1" w:tplc="100C0019" w:tentative="1">
-      <w:start w:val="1"/>
-      <w:numFmt w:val="lowerLetter"/>
-      <w:lvlText w:val="%2."/>
-      <w:lvlJc w:val="left"/>
-      <w:pPr>
-        <w:ind w:left="1440" w:hanging="360"/>
-      </w:pPr>
-    </w:lvl>
-    <w:lvl w:ilvl="2" w:tplc="100C001B" w:tentative="1">
-      <w:start w:val="1"/>
-      <w:numFmt w:val="lowerRoman"/>
-      <w:lvlText w:val="%3."/>
-      <w:lvlJc w:val="right"/>
-      <w:pPr>
-        <w:ind w:left="2160" w:hanging="180"/>
-      </w:pPr>
-    </w:lvl>
-    <w:lvl w:ilvl="3" w:tplc="100C000F" w:tentative="1">
-      <w:start w:val="1"/>
-      <w:numFmt w:val="decimal"/>
-      <w:lvlText w:val="%4."/>
-      <w:lvlJc w:val="left"/>
-      <w:pPr>
-        <w:ind w:left="2880" w:hanging="360"/>
-      </w:pPr>
-    </w:lvl>
-    <w:lvl w:ilvl="4" w:tplc="100C0019" w:tentative="1">
-      <w:start w:val="1"/>
-      <w:numFmt w:val="lowerLetter"/>
-      <w:lvlText w:val="%5."/>
-      <w:lvlJc w:val="left"/>
-      <w:pPr>
-        <w:ind w:left="3600" w:hanging="360"/>
-      </w:pPr>
-    </w:lvl>
-    <w:lvl w:ilvl="5" w:tplc="100C001B" w:tentative="1">
-      <w:start w:val="1"/>
-      <w:numFmt w:val="lowerRoman"/>
-      <w:lvlText w:val="%6."/>
-      <w:lvlJc w:val="right"/>
-      <w:pPr>
-        <w:ind w:left="4320" w:hanging="180"/>
-      </w:pPr>
-    </w:lvl>
-    <w:lvl w:ilvl="6" w:tplc="100C000F" w:tentative="1">
-      <w:start w:val="1"/>
-      <w:numFmt w:val="decimal"/>
-      <w:lvlText w:val="%7."/>
-      <w:lvlJc w:val="left"/>
-      <w:pPr>
-        <w:ind w:left="5040" w:hanging="360"/>
-      </w:pPr>
-    </w:lvl>
-    <w:lvl w:ilvl="7" w:tplc="100C0019" w:tentative="1">
-      <w:start w:val="1"/>
-      <w:numFmt w:val="lowerLetter"/>
-      <w:lvlText w:val="%8."/>
-      <w:lvlJc w:val="left"/>
-      <w:pPr>
-        <w:ind w:left="5760" w:hanging="360"/>
-      </w:pPr>
-    </w:lvl>
-    <w:lvl w:ilvl="8" w:tplc="100C001B" w:tentative="1">
-      <w:start w:val="1"/>
-      <w:numFmt w:val="lowerRoman"/>
-      <w:lvlText w:val="%9."/>
-      <w:lvlJc w:val="right"/>
-      <w:pPr>
-        <w:ind w:left="6480" w:hanging="180"/>
-      </w:pPr>
-    </w:lvl>
-  </w:abstractNum>
-  <w:abstractNum w:abstractNumId="8" w15:restartNumberingAfterBreak="0">
-    <w:nsid w:val="11DA1B0C"/>
-    <w:multiLevelType w:val="hybridMultilevel"/>
-    <w:tmpl w:val="887EEF08"/>
-    <w:lvl w:ilvl="0" w:tplc="0807000F">
-      <w:start w:val="1"/>
-      <w:numFmt w:val="decimal"/>
-      <w:lvlText w:val="%1."/>
-      <w:lvlJc w:val="left"/>
-      <w:pPr>
-        <w:ind w:left="720" w:hanging="360"/>
-      </w:pPr>
-    </w:lvl>
-    <w:lvl w:ilvl="1" w:tplc="08070019" w:tentative="1">
-      <w:start w:val="1"/>
-      <w:numFmt w:val="lowerLetter"/>
-      <w:lvlText w:val="%2."/>
-      <w:lvlJc w:val="left"/>
-      <w:pPr>
-        <w:ind w:left="1440" w:hanging="360"/>
-      </w:pPr>
-    </w:lvl>
-    <w:lvl w:ilvl="2" w:tplc="0807001B" w:tentative="1">
-      <w:start w:val="1"/>
-      <w:numFmt w:val="lowerRoman"/>
-      <w:lvlText w:val="%3."/>
-      <w:lvlJc w:val="right"/>
-      <w:pPr>
-        <w:ind w:left="2160" w:hanging="180"/>
-      </w:pPr>
-    </w:lvl>
-    <w:lvl w:ilvl="3" w:tplc="0807000F" w:tentative="1">
-      <w:start w:val="1"/>
-      <w:numFmt w:val="decimal"/>
-      <w:lvlText w:val="%4."/>
-      <w:lvlJc w:val="left"/>
-      <w:pPr>
-        <w:ind w:left="2880" w:hanging="360"/>
-      </w:pPr>
-    </w:lvl>
-    <w:lvl w:ilvl="4" w:tplc="08070019" w:tentative="1">
-      <w:start w:val="1"/>
-      <w:numFmt w:val="lowerLetter"/>
-      <w:lvlText w:val="%5."/>
-      <w:lvlJc w:val="left"/>
-      <w:pPr>
-        <w:ind w:left="3600" w:hanging="360"/>
-      </w:pPr>
-    </w:lvl>
-    <w:lvl w:ilvl="5" w:tplc="0807001B" w:tentative="1">
-      <w:start w:val="1"/>
-      <w:numFmt w:val="lowerRoman"/>
-      <w:lvlText w:val="%6."/>
-      <w:lvlJc w:val="right"/>
-      <w:pPr>
-        <w:ind w:left="4320" w:hanging="180"/>
-      </w:pPr>
-    </w:lvl>
-    <w:lvl w:ilvl="6" w:tplc="0807000F" w:tentative="1">
-      <w:start w:val="1"/>
-      <w:numFmt w:val="decimal"/>
-      <w:lvlText w:val="%7."/>
-      <w:lvlJc w:val="left"/>
-      <w:pPr>
-        <w:ind w:left="5040" w:hanging="360"/>
-      </w:pPr>
-    </w:lvl>
-    <w:lvl w:ilvl="7" w:tplc="08070019" w:tentative="1">
-      <w:start w:val="1"/>
-      <w:numFmt w:val="lowerLetter"/>
-      <w:lvlText w:val="%8."/>
-      <w:lvlJc w:val="left"/>
-      <w:pPr>
-        <w:ind w:left="5760" w:hanging="360"/>
-      </w:pPr>
-    </w:lvl>
-    <w:lvl w:ilvl="8" w:tplc="0807001B" w:tentative="1">
-      <w:start w:val="1"/>
-      <w:numFmt w:val="lowerRoman"/>
-      <w:lvlText w:val="%9."/>
-      <w:lvlJc w:val="right"/>
-      <w:pPr>
-        <w:ind w:left="6480" w:hanging="180"/>
-      </w:pPr>
-    </w:lvl>
-  </w:abstractNum>
-  <w:abstractNum w:abstractNumId="9" w15:restartNumberingAfterBreak="0">
+  <w:abstractNum w:abstractNumId="2" w15:restartNumberingAfterBreak="0">
     <w:nsid w:val="133C0EEB"/>
     <w:multiLevelType w:val="multilevel"/>
     <w:tmpl w:val="2E3ADB48"/>
@@ -12059,209 +11522,7 @@
       </w:rPr>
     </w:lvl>
   </w:abstractNum>
-  <w:abstractNum w:abstractNumId="10" w15:restartNumberingAfterBreak="0">
-    <w:nsid w:val="13972FB7"/>
-    <w:multiLevelType w:val="hybridMultilevel"/>
-    <w:tmpl w:val="8BF81F70"/>
-    <w:lvl w:ilvl="0" w:tplc="B75CBDB8">
-      <w:start w:val="1"/>
-      <w:numFmt w:val="bullet"/>
-      <w:lvlText w:val=""/>
-      <w:lvlJc w:val="left"/>
-      <w:pPr>
-        <w:ind w:left="360" w:hanging="360"/>
-      </w:pPr>
-      <w:rPr>
-        <w:rFonts w:ascii="Symbol" w:hAnsi="Symbol" w:hint="default"/>
-      </w:rPr>
-    </w:lvl>
-    <w:lvl w:ilvl="1" w:tplc="100C0003" w:tentative="1">
-      <w:start w:val="1"/>
-      <w:numFmt w:val="bullet"/>
-      <w:lvlText w:val="o"/>
-      <w:lvlJc w:val="left"/>
-      <w:pPr>
-        <w:ind w:left="1080" w:hanging="360"/>
-      </w:pPr>
-      <w:rPr>
-        <w:rFonts w:ascii="Courier New" w:hAnsi="Courier New" w:cs="Courier New" w:hint="default"/>
-      </w:rPr>
-    </w:lvl>
-    <w:lvl w:ilvl="2" w:tplc="100C0005" w:tentative="1">
-      <w:start w:val="1"/>
-      <w:numFmt w:val="bullet"/>
-      <w:lvlText w:val=""/>
-      <w:lvlJc w:val="left"/>
-      <w:pPr>
-        <w:ind w:left="1800" w:hanging="360"/>
-      </w:pPr>
-      <w:rPr>
-        <w:rFonts w:ascii="Wingdings" w:hAnsi="Wingdings" w:hint="default"/>
-      </w:rPr>
-    </w:lvl>
-    <w:lvl w:ilvl="3" w:tplc="100C0001" w:tentative="1">
-      <w:start w:val="1"/>
-      <w:numFmt w:val="bullet"/>
-      <w:lvlText w:val=""/>
-      <w:lvlJc w:val="left"/>
-      <w:pPr>
-        <w:ind w:left="2520" w:hanging="360"/>
-      </w:pPr>
-      <w:rPr>
-        <w:rFonts w:ascii="Symbol" w:hAnsi="Symbol" w:hint="default"/>
-      </w:rPr>
-    </w:lvl>
-    <w:lvl w:ilvl="4" w:tplc="100C0003" w:tentative="1">
-      <w:start w:val="1"/>
-      <w:numFmt w:val="bullet"/>
-      <w:lvlText w:val="o"/>
-      <w:lvlJc w:val="left"/>
-      <w:pPr>
-        <w:ind w:left="3240" w:hanging="360"/>
-      </w:pPr>
-      <w:rPr>
-        <w:rFonts w:ascii="Courier New" w:hAnsi="Courier New" w:cs="Courier New" w:hint="default"/>
-      </w:rPr>
-    </w:lvl>
-    <w:lvl w:ilvl="5" w:tplc="100C0005" w:tentative="1">
-      <w:start w:val="1"/>
-      <w:numFmt w:val="bullet"/>
-      <w:lvlText w:val=""/>
-      <w:lvlJc w:val="left"/>
-      <w:pPr>
-        <w:ind w:left="3960" w:hanging="360"/>
-      </w:pPr>
-      <w:rPr>
-        <w:rFonts w:ascii="Wingdings" w:hAnsi="Wingdings" w:hint="default"/>
-      </w:rPr>
-    </w:lvl>
-    <w:lvl w:ilvl="6" w:tplc="100C0001" w:tentative="1">
-      <w:start w:val="1"/>
-      <w:numFmt w:val="bullet"/>
-      <w:lvlText w:val=""/>
-      <w:lvlJc w:val="left"/>
-      <w:pPr>
-        <w:ind w:left="4680" w:hanging="360"/>
-      </w:pPr>
-      <w:rPr>
-        <w:rFonts w:ascii="Symbol" w:hAnsi="Symbol" w:hint="default"/>
-      </w:rPr>
-    </w:lvl>
-    <w:lvl w:ilvl="7" w:tplc="100C0003" w:tentative="1">
-      <w:start w:val="1"/>
-      <w:numFmt w:val="bullet"/>
-      <w:lvlText w:val="o"/>
-      <w:lvlJc w:val="left"/>
-      <w:pPr>
-        <w:ind w:left="5400" w:hanging="360"/>
-      </w:pPr>
-      <w:rPr>
-        <w:rFonts w:ascii="Courier New" w:hAnsi="Courier New" w:cs="Courier New" w:hint="default"/>
-      </w:rPr>
-    </w:lvl>
-    <w:lvl w:ilvl="8" w:tplc="100C0005" w:tentative="1">
-      <w:start w:val="1"/>
-      <w:numFmt w:val="bullet"/>
-      <w:lvlText w:val=""/>
-      <w:lvlJc w:val="left"/>
-      <w:pPr>
-        <w:ind w:left="6120" w:hanging="360"/>
-      </w:pPr>
-      <w:rPr>
-        <w:rFonts w:ascii="Wingdings" w:hAnsi="Wingdings" w:hint="default"/>
-      </w:rPr>
-    </w:lvl>
-  </w:abstractNum>
-  <w:abstractNum w:abstractNumId="11" w15:restartNumberingAfterBreak="0">
-    <w:nsid w:val="179F5441"/>
-    <w:multiLevelType w:val="hybridMultilevel"/>
-    <w:tmpl w:val="E058293C"/>
-    <w:lvl w:ilvl="0" w:tplc="100C000F">
-      <w:start w:val="1"/>
-      <w:numFmt w:val="decimal"/>
-      <w:lvlText w:val="%1."/>
-      <w:lvlJc w:val="left"/>
-      <w:pPr>
-        <w:ind w:left="720" w:hanging="360"/>
-      </w:pPr>
-      <w:rPr>
-        <w:rFonts w:hint="default"/>
-      </w:rPr>
-    </w:lvl>
-    <w:lvl w:ilvl="1" w:tplc="100C0019" w:tentative="1">
-      <w:start w:val="1"/>
-      <w:numFmt w:val="lowerLetter"/>
-      <w:lvlText w:val="%2."/>
-      <w:lvlJc w:val="left"/>
-      <w:pPr>
-        <w:ind w:left="1440" w:hanging="360"/>
-      </w:pPr>
-    </w:lvl>
-    <w:lvl w:ilvl="2" w:tplc="100C001B" w:tentative="1">
-      <w:start w:val="1"/>
-      <w:numFmt w:val="lowerRoman"/>
-      <w:lvlText w:val="%3."/>
-      <w:lvlJc w:val="right"/>
-      <w:pPr>
-        <w:ind w:left="2160" w:hanging="180"/>
-      </w:pPr>
-    </w:lvl>
-    <w:lvl w:ilvl="3" w:tplc="100C000F" w:tentative="1">
-      <w:start w:val="1"/>
-      <w:numFmt w:val="decimal"/>
-      <w:lvlText w:val="%4."/>
-      <w:lvlJc w:val="left"/>
-      <w:pPr>
-        <w:ind w:left="2880" w:hanging="360"/>
-      </w:pPr>
-    </w:lvl>
-    <w:lvl w:ilvl="4" w:tplc="100C0019" w:tentative="1">
-      <w:start w:val="1"/>
-      <w:numFmt w:val="lowerLetter"/>
-      <w:lvlText w:val="%5."/>
-      <w:lvlJc w:val="left"/>
-      <w:pPr>
-        <w:ind w:left="3600" w:hanging="360"/>
-      </w:pPr>
-    </w:lvl>
-    <w:lvl w:ilvl="5" w:tplc="100C001B" w:tentative="1">
-      <w:start w:val="1"/>
-      <w:numFmt w:val="lowerRoman"/>
-      <w:lvlText w:val="%6."/>
-      <w:lvlJc w:val="right"/>
-      <w:pPr>
-        <w:ind w:left="4320" w:hanging="180"/>
-      </w:pPr>
-    </w:lvl>
-    <w:lvl w:ilvl="6" w:tplc="100C000F" w:tentative="1">
-      <w:start w:val="1"/>
-      <w:numFmt w:val="decimal"/>
-      <w:lvlText w:val="%7."/>
-      <w:lvlJc w:val="left"/>
-      <w:pPr>
-        <w:ind w:left="5040" w:hanging="360"/>
-      </w:pPr>
-    </w:lvl>
-    <w:lvl w:ilvl="7" w:tplc="100C0019" w:tentative="1">
-      <w:start w:val="1"/>
-      <w:numFmt w:val="lowerLetter"/>
-      <w:lvlText w:val="%8."/>
-      <w:lvlJc w:val="left"/>
-      <w:pPr>
-        <w:ind w:left="5760" w:hanging="360"/>
-      </w:pPr>
-    </w:lvl>
-    <w:lvl w:ilvl="8" w:tplc="100C001B" w:tentative="1">
-      <w:start w:val="1"/>
-      <w:numFmt w:val="lowerRoman"/>
-      <w:lvlText w:val="%9."/>
-      <w:lvlJc w:val="right"/>
-      <w:pPr>
-        <w:ind w:left="6480" w:hanging="180"/>
-      </w:pPr>
-    </w:lvl>
-  </w:abstractNum>
-  <w:abstractNum w:abstractNumId="12" w15:restartNumberingAfterBreak="0">
+  <w:abstractNum w:abstractNumId="3" w15:restartNumberingAfterBreak="0">
     <w:nsid w:val="18EB2A55"/>
     <w:multiLevelType w:val="multilevel"/>
     <w:tmpl w:val="817866BC"/>
@@ -12383,7 +11644,7 @@
       </w:rPr>
     </w:lvl>
   </w:abstractNum>
-  <w:abstractNum w:abstractNumId="13" w15:restartNumberingAfterBreak="0">
+  <w:abstractNum w:abstractNumId="4" w15:restartNumberingAfterBreak="0">
     <w:nsid w:val="1A0C00A2"/>
     <w:multiLevelType w:val="hybridMultilevel"/>
     <w:tmpl w:val="E4DE93CC"/>
@@ -12470,7 +11731,7 @@
       </w:pPr>
     </w:lvl>
   </w:abstractNum>
-  <w:abstractNum w:abstractNumId="14" w15:restartNumberingAfterBreak="0">
+  <w:abstractNum w:abstractNumId="5" w15:restartNumberingAfterBreak="0">
     <w:nsid w:val="1DBB3E45"/>
     <w:multiLevelType w:val="multilevel"/>
     <w:tmpl w:val="0DA02B0C"/>
@@ -12594,224 +11855,7 @@
       </w:rPr>
     </w:lvl>
   </w:abstractNum>
-  <w:abstractNum w:abstractNumId="15" w15:restartNumberingAfterBreak="0">
-    <w:nsid w:val="1ED101D2"/>
-    <w:multiLevelType w:val="hybridMultilevel"/>
-    <w:tmpl w:val="12EC2542"/>
-    <w:lvl w:ilvl="0" w:tplc="9C805624">
-      <w:start w:val="1"/>
-      <w:numFmt w:val="bullet"/>
-      <w:lvlText w:val="-"/>
-      <w:lvlJc w:val="left"/>
-      <w:pPr>
-        <w:ind w:left="360" w:hanging="360"/>
-      </w:pPr>
-      <w:rPr>
-        <w:rFonts w:ascii="Arial" w:hAnsi="Arial" w:hint="default"/>
-        <w:b w:val="0"/>
-        <w:i w:val="0"/>
-        <w:caps w:val="0"/>
-        <w:strike w:val="0"/>
-        <w:dstrike w:val="0"/>
-        <w:vanish w:val="0"/>
-        <w:color w:val="000000"/>
-        <w:sz w:val="20"/>
-        <w:szCs w:val="20"/>
-        <w:vertAlign w:val="baseline"/>
-        <w14:shadow w14:blurRad="0" w14:dist="0" w14:dir="0" w14:sx="0" w14:sy="0" w14:kx="0" w14:ky="0" w14:algn="none">
-          <w14:srgbClr w14:val="000000"/>
-        </w14:shadow>
-        <w14:textOutline w14:w="0" w14:cap="rnd" w14:cmpd="sng" w14:algn="ctr">
-          <w14:noFill/>
-          <w14:prstDash w14:val="solid"/>
-          <w14:bevel/>
-        </w14:textOutline>
-      </w:rPr>
-    </w:lvl>
-    <w:lvl w:ilvl="1" w:tplc="100C0003" w:tentative="1">
-      <w:start w:val="1"/>
-      <w:numFmt w:val="bullet"/>
-      <w:lvlText w:val="o"/>
-      <w:lvlJc w:val="left"/>
-      <w:pPr>
-        <w:ind w:left="1080" w:hanging="360"/>
-      </w:pPr>
-      <w:rPr>
-        <w:rFonts w:ascii="Courier New" w:hAnsi="Courier New" w:cs="Courier New" w:hint="default"/>
-      </w:rPr>
-    </w:lvl>
-    <w:lvl w:ilvl="2" w:tplc="100C0005" w:tentative="1">
-      <w:start w:val="1"/>
-      <w:numFmt w:val="bullet"/>
-      <w:lvlText w:val=""/>
-      <w:lvlJc w:val="left"/>
-      <w:pPr>
-        <w:ind w:left="1800" w:hanging="360"/>
-      </w:pPr>
-      <w:rPr>
-        <w:rFonts w:ascii="Wingdings" w:hAnsi="Wingdings" w:hint="default"/>
-      </w:rPr>
-    </w:lvl>
-    <w:lvl w:ilvl="3" w:tplc="100C0001" w:tentative="1">
-      <w:start w:val="1"/>
-      <w:numFmt w:val="bullet"/>
-      <w:lvlText w:val=""/>
-      <w:lvlJc w:val="left"/>
-      <w:pPr>
-        <w:ind w:left="2520" w:hanging="360"/>
-      </w:pPr>
-      <w:rPr>
-        <w:rFonts w:ascii="Symbol" w:hAnsi="Symbol" w:hint="default"/>
-      </w:rPr>
-    </w:lvl>
-    <w:lvl w:ilvl="4" w:tplc="100C0003" w:tentative="1">
-      <w:start w:val="1"/>
-      <w:numFmt w:val="bullet"/>
-      <w:lvlText w:val="o"/>
-      <w:lvlJc w:val="left"/>
-      <w:pPr>
-        <w:ind w:left="3240" w:hanging="360"/>
-      </w:pPr>
-      <w:rPr>
-        <w:rFonts w:ascii="Courier New" w:hAnsi="Courier New" w:cs="Courier New" w:hint="default"/>
-      </w:rPr>
-    </w:lvl>
-    <w:lvl w:ilvl="5" w:tplc="100C0005" w:tentative="1">
-      <w:start w:val="1"/>
-      <w:numFmt w:val="bullet"/>
-      <w:lvlText w:val=""/>
-      <w:lvlJc w:val="left"/>
-      <w:pPr>
-        <w:ind w:left="3960" w:hanging="360"/>
-      </w:pPr>
-      <w:rPr>
-        <w:rFonts w:ascii="Wingdings" w:hAnsi="Wingdings" w:hint="default"/>
-      </w:rPr>
-    </w:lvl>
-    <w:lvl w:ilvl="6" w:tplc="100C0001" w:tentative="1">
-      <w:start w:val="1"/>
-      <w:numFmt w:val="bullet"/>
-      <w:lvlText w:val=""/>
-      <w:lvlJc w:val="left"/>
-      <w:pPr>
-        <w:ind w:left="4680" w:hanging="360"/>
-      </w:pPr>
-      <w:rPr>
-        <w:rFonts w:ascii="Symbol" w:hAnsi="Symbol" w:hint="default"/>
-      </w:rPr>
-    </w:lvl>
-    <w:lvl w:ilvl="7" w:tplc="100C0003" w:tentative="1">
-      <w:start w:val="1"/>
-      <w:numFmt w:val="bullet"/>
-      <w:lvlText w:val="o"/>
-      <w:lvlJc w:val="left"/>
-      <w:pPr>
-        <w:ind w:left="5400" w:hanging="360"/>
-      </w:pPr>
-      <w:rPr>
-        <w:rFonts w:ascii="Courier New" w:hAnsi="Courier New" w:cs="Courier New" w:hint="default"/>
-      </w:rPr>
-    </w:lvl>
-    <w:lvl w:ilvl="8" w:tplc="100C0005" w:tentative="1">
-      <w:start w:val="1"/>
-      <w:numFmt w:val="bullet"/>
-      <w:lvlText w:val=""/>
-      <w:lvlJc w:val="left"/>
-      <w:pPr>
-        <w:ind w:left="6120" w:hanging="360"/>
-      </w:pPr>
-      <w:rPr>
-        <w:rFonts w:ascii="Wingdings" w:hAnsi="Wingdings" w:hint="default"/>
-      </w:rPr>
-    </w:lvl>
-  </w:abstractNum>
-  <w:abstractNum w:abstractNumId="16" w15:restartNumberingAfterBreak="0">
-    <w:nsid w:val="1ED33453"/>
-    <w:multiLevelType w:val="hybridMultilevel"/>
-    <w:tmpl w:val="487E619A"/>
-    <w:lvl w:ilvl="0" w:tplc="C6FEA1E2">
-      <w:start w:val="1"/>
-      <w:numFmt w:val="decimal"/>
-      <w:lvlText w:val="%1."/>
-      <w:lvlJc w:val="left"/>
-      <w:pPr>
-        <w:ind w:left="720" w:hanging="360"/>
-      </w:pPr>
-    </w:lvl>
-    <w:lvl w:ilvl="1" w:tplc="08070019">
-      <w:start w:val="1"/>
-      <w:numFmt w:val="lowerLetter"/>
-      <w:lvlText w:val="%2."/>
-      <w:lvlJc w:val="left"/>
-      <w:pPr>
-        <w:ind w:left="1440" w:hanging="360"/>
-      </w:pPr>
-    </w:lvl>
-    <w:lvl w:ilvl="2" w:tplc="0807001B" w:tentative="1">
-      <w:start w:val="1"/>
-      <w:numFmt w:val="lowerRoman"/>
-      <w:lvlText w:val="%3."/>
-      <w:lvlJc w:val="right"/>
-      <w:pPr>
-        <w:ind w:left="2160" w:hanging="180"/>
-      </w:pPr>
-    </w:lvl>
-    <w:lvl w:ilvl="3" w:tplc="0807000F" w:tentative="1">
-      <w:start w:val="1"/>
-      <w:numFmt w:val="decimal"/>
-      <w:lvlText w:val="%4."/>
-      <w:lvlJc w:val="left"/>
-      <w:pPr>
-        <w:ind w:left="2880" w:hanging="360"/>
-      </w:pPr>
-    </w:lvl>
-    <w:lvl w:ilvl="4" w:tplc="08070019" w:tentative="1">
-      <w:start w:val="1"/>
-      <w:numFmt w:val="lowerLetter"/>
-      <w:lvlText w:val="%5."/>
-      <w:lvlJc w:val="left"/>
-      <w:pPr>
-        <w:ind w:left="3600" w:hanging="360"/>
-      </w:pPr>
-    </w:lvl>
-    <w:lvl w:ilvl="5" w:tplc="0807001B" w:tentative="1">
-      <w:start w:val="1"/>
-      <w:numFmt w:val="lowerRoman"/>
-      <w:lvlText w:val="%6."/>
-      <w:lvlJc w:val="right"/>
-      <w:pPr>
-        <w:ind w:left="4320" w:hanging="180"/>
-      </w:pPr>
-    </w:lvl>
-    <w:lvl w:ilvl="6" w:tplc="0807000F" w:tentative="1">
-      <w:start w:val="1"/>
-      <w:numFmt w:val="decimal"/>
-      <w:lvlText w:val="%7."/>
-      <w:lvlJc w:val="left"/>
-      <w:pPr>
-        <w:ind w:left="5040" w:hanging="360"/>
-      </w:pPr>
-    </w:lvl>
-    <w:lvl w:ilvl="7" w:tplc="08070019" w:tentative="1">
-      <w:start w:val="1"/>
-      <w:numFmt w:val="lowerLetter"/>
-      <w:lvlText w:val="%8."/>
-      <w:lvlJc w:val="left"/>
-      <w:pPr>
-        <w:ind w:left="5760" w:hanging="360"/>
-      </w:pPr>
-    </w:lvl>
-    <w:lvl w:ilvl="8" w:tplc="0807001B" w:tentative="1">
-      <w:start w:val="1"/>
-      <w:numFmt w:val="lowerRoman"/>
-      <w:lvlText w:val="%9."/>
-      <w:lvlJc w:val="right"/>
-      <w:pPr>
-        <w:ind w:left="6480" w:hanging="180"/>
-      </w:pPr>
-    </w:lvl>
-  </w:abstractNum>
-  <w:abstractNum w:abstractNumId="17" w15:restartNumberingAfterBreak="0">
+  <w:abstractNum w:abstractNumId="6" w15:restartNumberingAfterBreak="0">
     <w:nsid w:val="1F9665B5"/>
     <w:multiLevelType w:val="multilevel"/>
     <w:tmpl w:val="8ABE2948"/>
@@ -12926,7 +11970,7 @@
       </w:rPr>
     </w:lvl>
   </w:abstractNum>
-  <w:abstractNum w:abstractNumId="18" w15:restartNumberingAfterBreak="0">
+  <w:abstractNum w:abstractNumId="7" w15:restartNumberingAfterBreak="0">
     <w:nsid w:val="1FDE3676"/>
     <w:multiLevelType w:val="multilevel"/>
     <w:tmpl w:val="1E9214C2"/>
@@ -13044,7 +12088,7 @@
       </w:pPr>
     </w:lvl>
   </w:abstractNum>
-  <w:abstractNum w:abstractNumId="19" w15:restartNumberingAfterBreak="0">
+  <w:abstractNum w:abstractNumId="8" w15:restartNumberingAfterBreak="0">
     <w:nsid w:val="216379A2"/>
     <w:multiLevelType w:val="multilevel"/>
     <w:tmpl w:val="C84EFBF0"/>
@@ -13167,7 +12211,7 @@
       </w:rPr>
     </w:lvl>
   </w:abstractNum>
-  <w:abstractNum w:abstractNumId="20" w15:restartNumberingAfterBreak="0">
+  <w:abstractNum w:abstractNumId="9" w15:restartNumberingAfterBreak="0">
     <w:nsid w:val="244826B7"/>
     <w:multiLevelType w:val="hybridMultilevel"/>
     <w:tmpl w:val="9478446C"/>
@@ -13254,7 +12298,7 @@
       </w:pPr>
     </w:lvl>
   </w:abstractNum>
-  <w:abstractNum w:abstractNumId="21" w15:restartNumberingAfterBreak="0">
+  <w:abstractNum w:abstractNumId="10" w15:restartNumberingAfterBreak="0">
     <w:nsid w:val="2CBF4B41"/>
     <w:multiLevelType w:val="multilevel"/>
     <w:tmpl w:val="5790A794"/>
@@ -13378,7 +12422,7 @@
       </w:rPr>
     </w:lvl>
   </w:abstractNum>
-  <w:abstractNum w:abstractNumId="22" w15:restartNumberingAfterBreak="0">
+  <w:abstractNum w:abstractNumId="11" w15:restartNumberingAfterBreak="0">
     <w:nsid w:val="2CFD278F"/>
     <w:multiLevelType w:val="hybridMultilevel"/>
     <w:tmpl w:val="F56009DC"/>
@@ -13492,233 +12536,7 @@
       </w:rPr>
     </w:lvl>
   </w:abstractNum>
-  <w:abstractNum w:abstractNumId="23" w15:restartNumberingAfterBreak="0">
-    <w:nsid w:val="2FAD294C"/>
-    <w:multiLevelType w:val="hybridMultilevel"/>
-    <w:tmpl w:val="6D7A7D68"/>
-    <w:lvl w:ilvl="0" w:tplc="4CD4E5EE">
-      <w:numFmt w:val="bullet"/>
-      <w:lvlText w:val="-"/>
-      <w:lvlJc w:val="left"/>
-      <w:pPr>
-        <w:ind w:left="720" w:hanging="360"/>
-      </w:pPr>
-      <w:rPr>
-        <w:rFonts w:ascii="Arial" w:eastAsiaTheme="minorHAnsi" w:hAnsi="Arial" w:cs="Arial" w:hint="default"/>
-      </w:rPr>
-    </w:lvl>
-    <w:lvl w:ilvl="1" w:tplc="100C0003" w:tentative="1">
-      <w:start w:val="1"/>
-      <w:numFmt w:val="bullet"/>
-      <w:lvlText w:val="o"/>
-      <w:lvlJc w:val="left"/>
-      <w:pPr>
-        <w:ind w:left="1440" w:hanging="360"/>
-      </w:pPr>
-      <w:rPr>
-        <w:rFonts w:ascii="Courier New" w:hAnsi="Courier New" w:cs="Courier New" w:hint="default"/>
-      </w:rPr>
-    </w:lvl>
-    <w:lvl w:ilvl="2" w:tplc="100C0005" w:tentative="1">
-      <w:start w:val="1"/>
-      <w:numFmt w:val="bullet"/>
-      <w:lvlText w:val=""/>
-      <w:lvlJc w:val="left"/>
-      <w:pPr>
-        <w:ind w:left="2160" w:hanging="360"/>
-      </w:pPr>
-      <w:rPr>
-        <w:rFonts w:ascii="Wingdings" w:hAnsi="Wingdings" w:hint="default"/>
-      </w:rPr>
-    </w:lvl>
-    <w:lvl w:ilvl="3" w:tplc="100C0001" w:tentative="1">
-      <w:start w:val="1"/>
-      <w:numFmt w:val="bullet"/>
-      <w:lvlText w:val=""/>
-      <w:lvlJc w:val="left"/>
-      <w:pPr>
-        <w:ind w:left="2880" w:hanging="360"/>
-      </w:pPr>
-      <w:rPr>
-        <w:rFonts w:ascii="Symbol" w:hAnsi="Symbol" w:hint="default"/>
-      </w:rPr>
-    </w:lvl>
-    <w:lvl w:ilvl="4" w:tplc="100C0003" w:tentative="1">
-      <w:start w:val="1"/>
-      <w:numFmt w:val="bullet"/>
-      <w:lvlText w:val="o"/>
-      <w:lvlJc w:val="left"/>
-      <w:pPr>
-        <w:ind w:left="3600" w:hanging="360"/>
-      </w:pPr>
-      <w:rPr>
-        <w:rFonts w:ascii="Courier New" w:hAnsi="Courier New" w:cs="Courier New" w:hint="default"/>
-      </w:rPr>
-    </w:lvl>
-    <w:lvl w:ilvl="5" w:tplc="100C0005" w:tentative="1">
-      <w:start w:val="1"/>
-      <w:numFmt w:val="bullet"/>
-      <w:lvlText w:val=""/>
-      <w:lvlJc w:val="left"/>
-      <w:pPr>
-        <w:ind w:left="4320" w:hanging="360"/>
-      </w:pPr>
-      <w:rPr>
-        <w:rFonts w:ascii="Wingdings" w:hAnsi="Wingdings" w:hint="default"/>
-      </w:rPr>
-    </w:lvl>
-    <w:lvl w:ilvl="6" w:tplc="100C0001" w:tentative="1">
-      <w:start w:val="1"/>
-      <w:numFmt w:val="bullet"/>
-      <w:lvlText w:val=""/>
-      <w:lvlJc w:val="left"/>
-      <w:pPr>
-        <w:ind w:left="5040" w:hanging="360"/>
-      </w:pPr>
-      <w:rPr>
-        <w:rFonts w:ascii="Symbol" w:hAnsi="Symbol" w:hint="default"/>
-      </w:rPr>
-    </w:lvl>
-    <w:lvl w:ilvl="7" w:tplc="100C0003" w:tentative="1">
-      <w:start w:val="1"/>
-      <w:numFmt w:val="bullet"/>
-      <w:lvlText w:val="o"/>
-      <w:lvlJc w:val="left"/>
-      <w:pPr>
-        <w:ind w:left="5760" w:hanging="360"/>
-      </w:pPr>
-      <w:rPr>
-        <w:rFonts w:ascii="Courier New" w:hAnsi="Courier New" w:cs="Courier New" w:hint="default"/>
-      </w:rPr>
-    </w:lvl>
-    <w:lvl w:ilvl="8" w:tplc="100C0005" w:tentative="1">
-      <w:start w:val="1"/>
-      <w:numFmt w:val="bullet"/>
-      <w:lvlText w:val=""/>
-      <w:lvlJc w:val="left"/>
-      <w:pPr>
-        <w:ind w:left="6480" w:hanging="360"/>
-      </w:pPr>
-      <w:rPr>
-        <w:rFonts w:ascii="Wingdings" w:hAnsi="Wingdings" w:hint="default"/>
-      </w:rPr>
-    </w:lvl>
-  </w:abstractNum>
-  <w:abstractNum w:abstractNumId="24" w15:restartNumberingAfterBreak="0">
-    <w:nsid w:val="330A4704"/>
-    <w:multiLevelType w:val="multilevel"/>
-    <w:tmpl w:val="7C90358C"/>
-    <w:lvl w:ilvl="0">
-      <w:start w:val="1"/>
-      <w:numFmt w:val="decimal"/>
-      <w:lvlText w:val="%1."/>
-      <w:lvlJc w:val="left"/>
-      <w:pPr>
-        <w:ind w:left="360" w:hanging="360"/>
-      </w:pPr>
-      <w:rPr>
-        <w:rFonts w:hint="default"/>
-      </w:rPr>
-    </w:lvl>
-    <w:lvl w:ilvl="1">
-      <w:start w:val="1"/>
-      <w:numFmt w:val="decimal"/>
-      <w:lvlText w:val="%1.%2."/>
-      <w:lvlJc w:val="left"/>
-      <w:pPr>
-        <w:ind w:left="792" w:hanging="432"/>
-      </w:pPr>
-      <w:rPr>
-        <w:rFonts w:hint="default"/>
-      </w:rPr>
-    </w:lvl>
-    <w:lvl w:ilvl="2">
-      <w:start w:val="1"/>
-      <w:numFmt w:val="decimal"/>
-      <w:lvlText w:val="%1.%2.%3."/>
-      <w:lvlJc w:val="left"/>
-      <w:pPr>
-        <w:ind w:left="1224" w:hanging="504"/>
-      </w:pPr>
-      <w:rPr>
-        <w:rFonts w:hint="default"/>
-        <w:b/>
-      </w:rPr>
-    </w:lvl>
-    <w:lvl w:ilvl="3">
-      <w:start w:val="1"/>
-      <w:numFmt w:val="decimal"/>
-      <w:lvlText w:val="%1.%2.%3.%4."/>
-      <w:lvlJc w:val="left"/>
-      <w:pPr>
-        <w:ind w:left="1728" w:hanging="648"/>
-      </w:pPr>
-      <w:rPr>
-        <w:rFonts w:hint="default"/>
-      </w:rPr>
-    </w:lvl>
-    <w:lvl w:ilvl="4">
-      <w:start w:val="1"/>
-      <w:numFmt w:val="decimal"/>
-      <w:lvlText w:val="%1.%2.%3.%4.%5."/>
-      <w:lvlJc w:val="left"/>
-      <w:pPr>
-        <w:ind w:left="2232" w:hanging="792"/>
-      </w:pPr>
-      <w:rPr>
-        <w:rFonts w:hint="default"/>
-      </w:rPr>
-    </w:lvl>
-    <w:lvl w:ilvl="5">
-      <w:start w:val="1"/>
-      <w:numFmt w:val="decimal"/>
-      <w:lvlText w:val="%1.%2.%3.%4.%5.%6."/>
-      <w:lvlJc w:val="left"/>
-      <w:pPr>
-        <w:ind w:left="2736" w:hanging="936"/>
-      </w:pPr>
-      <w:rPr>
-        <w:rFonts w:hint="default"/>
-      </w:rPr>
-    </w:lvl>
-    <w:lvl w:ilvl="6">
-      <w:start w:val="1"/>
-      <w:numFmt w:val="decimal"/>
-      <w:lvlText w:val="%1.%2.%3.%4.%5.%6.%7."/>
-      <w:lvlJc w:val="left"/>
-      <w:pPr>
-        <w:ind w:left="3240" w:hanging="1080"/>
-      </w:pPr>
-      <w:rPr>
-        <w:rFonts w:hint="default"/>
-      </w:rPr>
-    </w:lvl>
-    <w:lvl w:ilvl="7">
-      <w:start w:val="1"/>
-      <w:numFmt w:val="decimal"/>
-      <w:lvlText w:val="%1.%2.%3.%4.%5.%6.%7.%8."/>
-      <w:lvlJc w:val="left"/>
-      <w:pPr>
-        <w:ind w:left="3744" w:hanging="1224"/>
-      </w:pPr>
-      <w:rPr>
-        <w:rFonts w:hint="default"/>
-      </w:rPr>
-    </w:lvl>
-    <w:lvl w:ilvl="8">
-      <w:start w:val="1"/>
-      <w:numFmt w:val="decimal"/>
-      <w:lvlText w:val="%1.%2.%3.%4.%5.%6.%7.%8.%9."/>
-      <w:lvlJc w:val="left"/>
-      <w:pPr>
-        <w:ind w:left="4320" w:hanging="1440"/>
-      </w:pPr>
-      <w:rPr>
-        <w:rFonts w:hint="default"/>
-      </w:rPr>
-    </w:lvl>
-  </w:abstractNum>
-  <w:abstractNum w:abstractNumId="25" w15:restartNumberingAfterBreak="0">
+  <w:abstractNum w:abstractNumId="12" w15:restartNumberingAfterBreak="0">
     <w:nsid w:val="36801CE8"/>
     <w:multiLevelType w:val="hybridMultilevel"/>
     <w:tmpl w:val="1F28CB02"/>
@@ -13808,7 +12626,7 @@
       </w:pPr>
     </w:lvl>
   </w:abstractNum>
-  <w:abstractNum w:abstractNumId="26" w15:restartNumberingAfterBreak="0">
+  <w:abstractNum w:abstractNumId="13" w15:restartNumberingAfterBreak="0">
     <w:nsid w:val="41C42B55"/>
     <w:multiLevelType w:val="hybridMultilevel"/>
     <w:tmpl w:val="4A60B6CC"/>
@@ -13895,7 +12713,7 @@
       </w:pPr>
     </w:lvl>
   </w:abstractNum>
-  <w:abstractNum w:abstractNumId="27" w15:restartNumberingAfterBreak="0">
+  <w:abstractNum w:abstractNumId="14" w15:restartNumberingAfterBreak="0">
     <w:nsid w:val="42347CEA"/>
     <w:multiLevelType w:val="multilevel"/>
     <w:tmpl w:val="CF20AB38"/>
@@ -14009,20 +12827,21 @@
       </w:rPr>
     </w:lvl>
   </w:abstractNum>
-  <w:abstractNum w:abstractNumId="28" w15:restartNumberingAfterBreak="0">
-    <w:nsid w:val="428F3A2C"/>
+  <w:abstractNum w:abstractNumId="15" w15:restartNumberingAfterBreak="0">
+    <w:nsid w:val="439039D5"/>
     <w:multiLevelType w:val="hybridMultilevel"/>
-    <w:tmpl w:val="F4FC10B6"/>
-    <w:lvl w:ilvl="0" w:tplc="60C845DC">
+    <w:tmpl w:val="AECE85A0"/>
+    <w:lvl w:ilvl="0" w:tplc="A42CB9EE">
       <w:start w:val="1"/>
       <w:numFmt w:val="bullet"/>
-      <w:lvlText w:val=""/>
+      <w:pStyle w:val="Aufzhlung7-Pfeil"/>
+      <w:lvlText w:val=""/>
       <w:lvlJc w:val="left"/>
       <w:pPr>
         <w:ind w:left="720" w:hanging="360"/>
       </w:pPr>
       <w:rPr>
-        <w:rFonts w:ascii="Symbol" w:hAnsi="Symbol" w:hint="default"/>
+        <w:rFonts w:ascii="Wingdings 3" w:hAnsi="Wingdings 3" w:hint="default"/>
       </w:rPr>
     </w:lvl>
     <w:lvl w:ilvl="1" w:tplc="08070003" w:tentative="1">
@@ -14122,234 +12941,7 @@
       </w:rPr>
     </w:lvl>
   </w:abstractNum>
-  <w:abstractNum w:abstractNumId="29" w15:restartNumberingAfterBreak="0">
-    <w:nsid w:val="439039D5"/>
-    <w:multiLevelType w:val="hybridMultilevel"/>
-    <w:tmpl w:val="AECE85A0"/>
-    <w:lvl w:ilvl="0" w:tplc="A42CB9EE">
-      <w:start w:val="1"/>
-      <w:numFmt w:val="bullet"/>
-      <w:pStyle w:val="Aufzhlung7-Pfeil"/>
-      <w:lvlText w:val=""/>
-      <w:lvlJc w:val="left"/>
-      <w:pPr>
-        <w:ind w:left="720" w:hanging="360"/>
-      </w:pPr>
-      <w:rPr>
-        <w:rFonts w:ascii="Wingdings 3" w:hAnsi="Wingdings 3" w:hint="default"/>
-      </w:rPr>
-    </w:lvl>
-    <w:lvl w:ilvl="1" w:tplc="08070003" w:tentative="1">
-      <w:start w:val="1"/>
-      <w:numFmt w:val="bullet"/>
-      <w:lvlText w:val="o"/>
-      <w:lvlJc w:val="left"/>
-      <w:pPr>
-        <w:ind w:left="1440" w:hanging="360"/>
-      </w:pPr>
-      <w:rPr>
-        <w:rFonts w:ascii="Courier New" w:hAnsi="Courier New" w:cs="Courier New" w:hint="default"/>
-      </w:rPr>
-    </w:lvl>
-    <w:lvl w:ilvl="2" w:tplc="08070005" w:tentative="1">
-      <w:start w:val="1"/>
-      <w:numFmt w:val="bullet"/>
-      <w:lvlText w:val=""/>
-      <w:lvlJc w:val="left"/>
-      <w:pPr>
-        <w:ind w:left="2160" w:hanging="360"/>
-      </w:pPr>
-      <w:rPr>
-        <w:rFonts w:ascii="Wingdings" w:hAnsi="Wingdings" w:hint="default"/>
-      </w:rPr>
-    </w:lvl>
-    <w:lvl w:ilvl="3" w:tplc="08070001" w:tentative="1">
-      <w:start w:val="1"/>
-      <w:numFmt w:val="bullet"/>
-      <w:lvlText w:val=""/>
-      <w:lvlJc w:val="left"/>
-      <w:pPr>
-        <w:ind w:left="2880" w:hanging="360"/>
-      </w:pPr>
-      <w:rPr>
-        <w:rFonts w:ascii="Symbol" w:hAnsi="Symbol" w:hint="default"/>
-      </w:rPr>
-    </w:lvl>
-    <w:lvl w:ilvl="4" w:tplc="08070003" w:tentative="1">
-      <w:start w:val="1"/>
-      <w:numFmt w:val="bullet"/>
-      <w:lvlText w:val="o"/>
-      <w:lvlJc w:val="left"/>
-      <w:pPr>
-        <w:ind w:left="3600" w:hanging="360"/>
-      </w:pPr>
-      <w:rPr>
-        <w:rFonts w:ascii="Courier New" w:hAnsi="Courier New" w:cs="Courier New" w:hint="default"/>
-      </w:rPr>
-    </w:lvl>
-    <w:lvl w:ilvl="5" w:tplc="08070005" w:tentative="1">
-      <w:start w:val="1"/>
-      <w:numFmt w:val="bullet"/>
-      <w:lvlText w:val=""/>
-      <w:lvlJc w:val="left"/>
-      <w:pPr>
-        <w:ind w:left="4320" w:hanging="360"/>
-      </w:pPr>
-      <w:rPr>
-        <w:rFonts w:ascii="Wingdings" w:hAnsi="Wingdings" w:hint="default"/>
-      </w:rPr>
-    </w:lvl>
-    <w:lvl w:ilvl="6" w:tplc="08070001" w:tentative="1">
-      <w:start w:val="1"/>
-      <w:numFmt w:val="bullet"/>
-      <w:lvlText w:val=""/>
-      <w:lvlJc w:val="left"/>
-      <w:pPr>
-        <w:ind w:left="5040" w:hanging="360"/>
-      </w:pPr>
-      <w:rPr>
-        <w:rFonts w:ascii="Symbol" w:hAnsi="Symbol" w:hint="default"/>
-      </w:rPr>
-    </w:lvl>
-    <w:lvl w:ilvl="7" w:tplc="08070003" w:tentative="1">
-      <w:start w:val="1"/>
-      <w:numFmt w:val="bullet"/>
-      <w:lvlText w:val="o"/>
-      <w:lvlJc w:val="left"/>
-      <w:pPr>
-        <w:ind w:left="5760" w:hanging="360"/>
-      </w:pPr>
-      <w:rPr>
-        <w:rFonts w:ascii="Courier New" w:hAnsi="Courier New" w:cs="Courier New" w:hint="default"/>
-      </w:rPr>
-    </w:lvl>
-    <w:lvl w:ilvl="8" w:tplc="08070005" w:tentative="1">
-      <w:start w:val="1"/>
-      <w:numFmt w:val="bullet"/>
-      <w:lvlText w:val=""/>
-      <w:lvlJc w:val="left"/>
-      <w:pPr>
-        <w:ind w:left="6480" w:hanging="360"/>
-      </w:pPr>
-      <w:rPr>
-        <w:rFonts w:ascii="Wingdings" w:hAnsi="Wingdings" w:hint="default"/>
-      </w:rPr>
-    </w:lvl>
-  </w:abstractNum>
-  <w:abstractNum w:abstractNumId="30" w15:restartNumberingAfterBreak="0">
-    <w:nsid w:val="443451CA"/>
-    <w:multiLevelType w:val="hybridMultilevel"/>
-    <w:tmpl w:val="1F824302"/>
-    <w:lvl w:ilvl="0" w:tplc="B75CBDB8">
-      <w:start w:val="1"/>
-      <w:numFmt w:val="bullet"/>
-      <w:lvlText w:val=""/>
-      <w:lvlJc w:val="left"/>
-      <w:pPr>
-        <w:ind w:left="360" w:hanging="360"/>
-      </w:pPr>
-      <w:rPr>
-        <w:rFonts w:ascii="Symbol" w:hAnsi="Symbol" w:hint="default"/>
-      </w:rPr>
-    </w:lvl>
-    <w:lvl w:ilvl="1" w:tplc="B75CBDB8">
-      <w:start w:val="1"/>
-      <w:numFmt w:val="bullet"/>
-      <w:lvlText w:val=""/>
-      <w:lvlJc w:val="left"/>
-      <w:pPr>
-        <w:ind w:left="1080" w:hanging="360"/>
-      </w:pPr>
-      <w:rPr>
-        <w:rFonts w:ascii="Symbol" w:hAnsi="Symbol" w:hint="default"/>
-      </w:rPr>
-    </w:lvl>
-    <w:lvl w:ilvl="2" w:tplc="100C0005" w:tentative="1">
-      <w:start w:val="1"/>
-      <w:numFmt w:val="bullet"/>
-      <w:lvlText w:val=""/>
-      <w:lvlJc w:val="left"/>
-      <w:pPr>
-        <w:ind w:left="1800" w:hanging="360"/>
-      </w:pPr>
-      <w:rPr>
-        <w:rFonts w:ascii="Wingdings" w:hAnsi="Wingdings" w:hint="default"/>
-      </w:rPr>
-    </w:lvl>
-    <w:lvl w:ilvl="3" w:tplc="100C0001" w:tentative="1">
-      <w:start w:val="1"/>
-      <w:numFmt w:val="bullet"/>
-      <w:lvlText w:val=""/>
-      <w:lvlJc w:val="left"/>
-      <w:pPr>
-        <w:ind w:left="2520" w:hanging="360"/>
-      </w:pPr>
-      <w:rPr>
-        <w:rFonts w:ascii="Symbol" w:hAnsi="Symbol" w:hint="default"/>
-      </w:rPr>
-    </w:lvl>
-    <w:lvl w:ilvl="4" w:tplc="100C0003" w:tentative="1">
-      <w:start w:val="1"/>
-      <w:numFmt w:val="bullet"/>
-      <w:lvlText w:val="o"/>
-      <w:lvlJc w:val="left"/>
-      <w:pPr>
-        <w:ind w:left="3240" w:hanging="360"/>
-      </w:pPr>
-      <w:rPr>
-        <w:rFonts w:ascii="Courier New" w:hAnsi="Courier New" w:cs="Courier New" w:hint="default"/>
-      </w:rPr>
-    </w:lvl>
-    <w:lvl w:ilvl="5" w:tplc="100C0005" w:tentative="1">
-      <w:start w:val="1"/>
-      <w:numFmt w:val="bullet"/>
-      <w:lvlText w:val=""/>
-      <w:lvlJc w:val="left"/>
-      <w:pPr>
-        <w:ind w:left="3960" w:hanging="360"/>
-      </w:pPr>
-      <w:rPr>
-        <w:rFonts w:ascii="Wingdings" w:hAnsi="Wingdings" w:hint="default"/>
-      </w:rPr>
-    </w:lvl>
-    <w:lvl w:ilvl="6" w:tplc="100C0001" w:tentative="1">
-      <w:start w:val="1"/>
-      <w:numFmt w:val="bullet"/>
-      <w:lvlText w:val=""/>
-      <w:lvlJc w:val="left"/>
-      <w:pPr>
-        <w:ind w:left="4680" w:hanging="360"/>
-      </w:pPr>
-      <w:rPr>
-        <w:rFonts w:ascii="Symbol" w:hAnsi="Symbol" w:hint="default"/>
-      </w:rPr>
-    </w:lvl>
-    <w:lvl w:ilvl="7" w:tplc="100C0003" w:tentative="1">
-      <w:start w:val="1"/>
-      <w:numFmt w:val="bullet"/>
-      <w:lvlText w:val="o"/>
-      <w:lvlJc w:val="left"/>
-      <w:pPr>
-        <w:ind w:left="5400" w:hanging="360"/>
-      </w:pPr>
-      <w:rPr>
-        <w:rFonts w:ascii="Courier New" w:hAnsi="Courier New" w:cs="Courier New" w:hint="default"/>
-      </w:rPr>
-    </w:lvl>
-    <w:lvl w:ilvl="8" w:tplc="100C0005" w:tentative="1">
-      <w:start w:val="1"/>
-      <w:numFmt w:val="bullet"/>
-      <w:lvlText w:val=""/>
-      <w:lvlJc w:val="left"/>
-      <w:pPr>
-        <w:ind w:left="6120" w:hanging="360"/>
-      </w:pPr>
-      <w:rPr>
-        <w:rFonts w:ascii="Wingdings" w:hAnsi="Wingdings" w:hint="default"/>
-      </w:rPr>
-    </w:lvl>
-  </w:abstractNum>
-  <w:abstractNum w:abstractNumId="31" w15:restartNumberingAfterBreak="0">
+  <w:abstractNum w:abstractNumId="16" w15:restartNumberingAfterBreak="0">
     <w:nsid w:val="44814701"/>
     <w:multiLevelType w:val="multilevel"/>
     <w:tmpl w:val="87C2BA84"/>
@@ -14472,7 +13064,7 @@
       </w:rPr>
     </w:lvl>
   </w:abstractNum>
-  <w:abstractNum w:abstractNumId="32" w15:restartNumberingAfterBreak="0">
+  <w:abstractNum w:abstractNumId="17" w15:restartNumberingAfterBreak="0">
     <w:nsid w:val="53F06D0C"/>
     <w:multiLevelType w:val="hybridMultilevel"/>
     <w:tmpl w:val="84CC13E6"/>
@@ -14586,435 +13178,7 @@
       </w:rPr>
     </w:lvl>
   </w:abstractNum>
-  <w:abstractNum w:abstractNumId="33" w15:restartNumberingAfterBreak="0">
-    <w:nsid w:val="5BF74FF9"/>
-    <w:multiLevelType w:val="multilevel"/>
-    <w:tmpl w:val="EE6EB3A4"/>
-    <w:lvl w:ilvl="0">
-      <w:start w:val="1"/>
-      <w:numFmt w:val="decimal"/>
-      <w:lvlText w:val="%1"/>
-      <w:lvlJc w:val="left"/>
-      <w:pPr>
-        <w:ind w:left="432" w:hanging="432"/>
-      </w:pPr>
-    </w:lvl>
-    <w:lvl w:ilvl="1">
-      <w:start w:val="1"/>
-      <w:numFmt w:val="decimal"/>
-      <w:lvlText w:val="%1.%2"/>
-      <w:lvlJc w:val="left"/>
-      <w:pPr>
-        <w:ind w:left="576" w:hanging="576"/>
-      </w:pPr>
-    </w:lvl>
-    <w:lvl w:ilvl="2">
-      <w:start w:val="1"/>
-      <w:numFmt w:val="decimal"/>
-      <w:lvlText w:val="%1.%2.%3"/>
-      <w:lvlJc w:val="left"/>
-      <w:pPr>
-        <w:ind w:left="720" w:hanging="720"/>
-      </w:pPr>
-      <w:rPr>
-        <w:b/>
-      </w:rPr>
-    </w:lvl>
-    <w:lvl w:ilvl="3">
-      <w:start w:val="1"/>
-      <w:numFmt w:val="decimal"/>
-      <w:lvlText w:val="%1.%2.%3.%4"/>
-      <w:lvlJc w:val="left"/>
-      <w:pPr>
-        <w:ind w:left="864" w:hanging="864"/>
-      </w:pPr>
-    </w:lvl>
-    <w:lvl w:ilvl="4">
-      <w:start w:val="1"/>
-      <w:numFmt w:val="decimal"/>
-      <w:lvlText w:val="%1.%2.%3.%4.%5"/>
-      <w:lvlJc w:val="left"/>
-      <w:pPr>
-        <w:ind w:left="1008" w:hanging="1008"/>
-      </w:pPr>
-    </w:lvl>
-    <w:lvl w:ilvl="5">
-      <w:start w:val="1"/>
-      <w:numFmt w:val="decimal"/>
-      <w:lvlText w:val="%1.%2.%3.%4.%5.%6"/>
-      <w:lvlJc w:val="left"/>
-      <w:pPr>
-        <w:ind w:left="1152" w:hanging="1152"/>
-      </w:pPr>
-    </w:lvl>
-    <w:lvl w:ilvl="6">
-      <w:start w:val="1"/>
-      <w:numFmt w:val="decimal"/>
-      <w:lvlText w:val="%1.%2.%3.%4.%5.%6.%7"/>
-      <w:lvlJc w:val="left"/>
-      <w:pPr>
-        <w:ind w:left="1296" w:hanging="1296"/>
-      </w:pPr>
-    </w:lvl>
-    <w:lvl w:ilvl="7">
-      <w:start w:val="1"/>
-      <w:numFmt w:val="decimal"/>
-      <w:lvlText w:val="%1.%2.%3.%4.%5.%6.%7.%8"/>
-      <w:lvlJc w:val="left"/>
-      <w:pPr>
-        <w:ind w:left="1440" w:hanging="1440"/>
-      </w:pPr>
-    </w:lvl>
-    <w:lvl w:ilvl="8">
-      <w:start w:val="1"/>
-      <w:numFmt w:val="decimal"/>
-      <w:lvlText w:val="%1.%2.%3.%4.%5.%6.%7.%8.%9"/>
-      <w:lvlJc w:val="left"/>
-      <w:pPr>
-        <w:ind w:left="1584" w:hanging="1584"/>
-      </w:pPr>
-    </w:lvl>
-  </w:abstractNum>
-  <w:abstractNum w:abstractNumId="34" w15:restartNumberingAfterBreak="0">
-    <w:nsid w:val="682C3660"/>
-    <w:multiLevelType w:val="hybridMultilevel"/>
-    <w:tmpl w:val="689EE88E"/>
-    <w:lvl w:ilvl="0" w:tplc="9C805624">
-      <w:start w:val="1"/>
-      <w:numFmt w:val="bullet"/>
-      <w:lvlText w:val="-"/>
-      <w:lvlJc w:val="left"/>
-      <w:pPr>
-        <w:ind w:left="360" w:hanging="360"/>
-      </w:pPr>
-      <w:rPr>
-        <w:rFonts w:ascii="Arial" w:hAnsi="Arial" w:hint="default"/>
-        <w:b w:val="0"/>
-        <w:i w:val="0"/>
-        <w:caps w:val="0"/>
-        <w:strike w:val="0"/>
-        <w:dstrike w:val="0"/>
-        <w:vanish w:val="0"/>
-        <w:color w:val="000000"/>
-        <w:sz w:val="20"/>
-        <w:szCs w:val="20"/>
-        <w:vertAlign w:val="baseline"/>
-        <w14:shadow w14:blurRad="0" w14:dist="0" w14:dir="0" w14:sx="0" w14:sy="0" w14:kx="0" w14:ky="0" w14:algn="none">
-          <w14:srgbClr w14:val="000000"/>
-        </w14:shadow>
-        <w14:textOutline w14:w="0" w14:cap="rnd" w14:cmpd="sng" w14:algn="ctr">
-          <w14:noFill/>
-          <w14:prstDash w14:val="solid"/>
-          <w14:bevel/>
-        </w14:textOutline>
-      </w:rPr>
-    </w:lvl>
-    <w:lvl w:ilvl="1" w:tplc="100C0003" w:tentative="1">
-      <w:start w:val="1"/>
-      <w:numFmt w:val="bullet"/>
-      <w:lvlText w:val="o"/>
-      <w:lvlJc w:val="left"/>
-      <w:pPr>
-        <w:ind w:left="1080" w:hanging="360"/>
-      </w:pPr>
-      <w:rPr>
-        <w:rFonts w:ascii="Courier New" w:hAnsi="Courier New" w:cs="Courier New" w:hint="default"/>
-      </w:rPr>
-    </w:lvl>
-    <w:lvl w:ilvl="2" w:tplc="100C0005" w:tentative="1">
-      <w:start w:val="1"/>
-      <w:numFmt w:val="bullet"/>
-      <w:lvlText w:val=""/>
-      <w:lvlJc w:val="left"/>
-      <w:pPr>
-        <w:ind w:left="1800" w:hanging="360"/>
-      </w:pPr>
-      <w:rPr>
-        <w:rFonts w:ascii="Wingdings" w:hAnsi="Wingdings" w:hint="default"/>
-      </w:rPr>
-    </w:lvl>
-    <w:lvl w:ilvl="3" w:tplc="100C0001" w:tentative="1">
-      <w:start w:val="1"/>
-      <w:numFmt w:val="bullet"/>
-      <w:lvlText w:val=""/>
-      <w:lvlJc w:val="left"/>
-      <w:pPr>
-        <w:ind w:left="2520" w:hanging="360"/>
-      </w:pPr>
-      <w:rPr>
-        <w:rFonts w:ascii="Symbol" w:hAnsi="Symbol" w:hint="default"/>
-      </w:rPr>
-    </w:lvl>
-    <w:lvl w:ilvl="4" w:tplc="100C0003" w:tentative="1">
-      <w:start w:val="1"/>
-      <w:numFmt w:val="bullet"/>
-      <w:lvlText w:val="o"/>
-      <w:lvlJc w:val="left"/>
-      <w:pPr>
-        <w:ind w:left="3240" w:hanging="360"/>
-      </w:pPr>
-      <w:rPr>
-        <w:rFonts w:ascii="Courier New" w:hAnsi="Courier New" w:cs="Courier New" w:hint="default"/>
-      </w:rPr>
-    </w:lvl>
-    <w:lvl w:ilvl="5" w:tplc="100C0005" w:tentative="1">
-      <w:start w:val="1"/>
-      <w:numFmt w:val="bullet"/>
-      <w:lvlText w:val=""/>
-      <w:lvlJc w:val="left"/>
-      <w:pPr>
-        <w:ind w:left="3960" w:hanging="360"/>
-      </w:pPr>
-      <w:rPr>
-        <w:rFonts w:ascii="Wingdings" w:hAnsi="Wingdings" w:hint="default"/>
-      </w:rPr>
-    </w:lvl>
-    <w:lvl w:ilvl="6" w:tplc="100C0001" w:tentative="1">
-      <w:start w:val="1"/>
-      <w:numFmt w:val="bullet"/>
-      <w:lvlText w:val=""/>
-      <w:lvlJc w:val="left"/>
-      <w:pPr>
-        <w:ind w:left="4680" w:hanging="360"/>
-      </w:pPr>
-      <w:rPr>
-        <w:rFonts w:ascii="Symbol" w:hAnsi="Symbol" w:hint="default"/>
-      </w:rPr>
-    </w:lvl>
-    <w:lvl w:ilvl="7" w:tplc="100C0003" w:tentative="1">
-      <w:start w:val="1"/>
-      <w:numFmt w:val="bullet"/>
-      <w:lvlText w:val="o"/>
-      <w:lvlJc w:val="left"/>
-      <w:pPr>
-        <w:ind w:left="5400" w:hanging="360"/>
-      </w:pPr>
-      <w:rPr>
-        <w:rFonts w:ascii="Courier New" w:hAnsi="Courier New" w:cs="Courier New" w:hint="default"/>
-      </w:rPr>
-    </w:lvl>
-    <w:lvl w:ilvl="8" w:tplc="100C0005" w:tentative="1">
-      <w:start w:val="1"/>
-      <w:numFmt w:val="bullet"/>
-      <w:lvlText w:val=""/>
-      <w:lvlJc w:val="left"/>
-      <w:pPr>
-        <w:ind w:left="6120" w:hanging="360"/>
-      </w:pPr>
-      <w:rPr>
-        <w:rFonts w:ascii="Wingdings" w:hAnsi="Wingdings" w:hint="default"/>
-      </w:rPr>
-    </w:lvl>
-  </w:abstractNum>
-  <w:abstractNum w:abstractNumId="35" w15:restartNumberingAfterBreak="0">
-    <w:nsid w:val="69640081"/>
-    <w:multiLevelType w:val="multilevel"/>
-    <w:tmpl w:val="04B623FC"/>
-    <w:lvl w:ilvl="0">
-      <w:start w:val="6"/>
-      <w:numFmt w:val="decimal"/>
-      <w:lvlText w:val="%1"/>
-      <w:lvlJc w:val="left"/>
-      <w:pPr>
-        <w:ind w:left="360" w:hanging="360"/>
-      </w:pPr>
-      <w:rPr>
-        <w:rFonts w:hint="default"/>
-        <w:b/>
-      </w:rPr>
-    </w:lvl>
-    <w:lvl w:ilvl="1">
-      <w:start w:val="1"/>
-      <w:numFmt w:val="decimal"/>
-      <w:lvlText w:val="%1.%2"/>
-      <w:lvlJc w:val="left"/>
-      <w:pPr>
-        <w:ind w:left="360" w:hanging="360"/>
-      </w:pPr>
-      <w:rPr>
-        <w:rFonts w:hint="default"/>
-        <w:b/>
-      </w:rPr>
-    </w:lvl>
-    <w:lvl w:ilvl="2">
-      <w:start w:val="1"/>
-      <w:numFmt w:val="decimal"/>
-      <w:lvlText w:val="%1.%2.%3"/>
-      <w:lvlJc w:val="left"/>
-      <w:pPr>
-        <w:ind w:left="720" w:hanging="720"/>
-      </w:pPr>
-      <w:rPr>
-        <w:rFonts w:hint="default"/>
-        <w:b/>
-      </w:rPr>
-    </w:lvl>
-    <w:lvl w:ilvl="3">
-      <w:start w:val="1"/>
-      <w:numFmt w:val="decimal"/>
-      <w:lvlText w:val="%1.%2.%3.%4"/>
-      <w:lvlJc w:val="left"/>
-      <w:pPr>
-        <w:ind w:left="1080" w:hanging="1080"/>
-      </w:pPr>
-      <w:rPr>
-        <w:rFonts w:hint="default"/>
-        <w:b/>
-      </w:rPr>
-    </w:lvl>
-    <w:lvl w:ilvl="4">
-      <w:start w:val="1"/>
-      <w:numFmt w:val="decimal"/>
-      <w:lvlText w:val="%1.%2.%3.%4.%5"/>
-      <w:lvlJc w:val="left"/>
-      <w:pPr>
-        <w:ind w:left="1080" w:hanging="1080"/>
-      </w:pPr>
-      <w:rPr>
-        <w:rFonts w:hint="default"/>
-        <w:b/>
-      </w:rPr>
-    </w:lvl>
-    <w:lvl w:ilvl="5">
-      <w:start w:val="1"/>
-      <w:numFmt w:val="decimal"/>
-      <w:lvlText w:val="%1.%2.%3.%4.%5.%6"/>
-      <w:lvlJc w:val="left"/>
-      <w:pPr>
-        <w:ind w:left="1440" w:hanging="1440"/>
-      </w:pPr>
-      <w:rPr>
-        <w:rFonts w:hint="default"/>
-        <w:b/>
-      </w:rPr>
-    </w:lvl>
-    <w:lvl w:ilvl="6">
-      <w:start w:val="1"/>
-      <w:numFmt w:val="decimal"/>
-      <w:lvlText w:val="%1.%2.%3.%4.%5.%6.%7"/>
-      <w:lvlJc w:val="left"/>
-      <w:pPr>
-        <w:ind w:left="1440" w:hanging="1440"/>
-      </w:pPr>
-      <w:rPr>
-        <w:rFonts w:hint="default"/>
-        <w:b/>
-      </w:rPr>
-    </w:lvl>
-    <w:lvl w:ilvl="7">
-      <w:start w:val="1"/>
-      <w:numFmt w:val="decimal"/>
-      <w:lvlText w:val="%1.%2.%3.%4.%5.%6.%7.%8"/>
-      <w:lvlJc w:val="left"/>
-      <w:pPr>
-        <w:ind w:left="1800" w:hanging="1800"/>
-      </w:pPr>
-      <w:rPr>
-        <w:rFonts w:hint="default"/>
-        <w:b/>
-      </w:rPr>
-    </w:lvl>
-    <w:lvl w:ilvl="8">
-      <w:start w:val="1"/>
-      <w:numFmt w:val="decimal"/>
-      <w:lvlText w:val="%1.%2.%3.%4.%5.%6.%7.%8.%9"/>
-      <w:lvlJc w:val="left"/>
-      <w:pPr>
-        <w:ind w:left="1800" w:hanging="1800"/>
-      </w:pPr>
-      <w:rPr>
-        <w:rFonts w:hint="default"/>
-        <w:b/>
-      </w:rPr>
-    </w:lvl>
-  </w:abstractNum>
-  <w:abstractNum w:abstractNumId="36" w15:restartNumberingAfterBreak="0">
-    <w:nsid w:val="78983175"/>
-    <w:multiLevelType w:val="hybridMultilevel"/>
-    <w:tmpl w:val="42C600FC"/>
-    <w:lvl w:ilvl="0" w:tplc="42424A7A">
-      <w:start w:val="1"/>
-      <w:numFmt w:val="decimal"/>
-      <w:lvlText w:val="%1."/>
-      <w:lvlJc w:val="left"/>
-      <w:pPr>
-        <w:ind w:left="720" w:hanging="360"/>
-      </w:pPr>
-    </w:lvl>
-    <w:lvl w:ilvl="1" w:tplc="08070019" w:tentative="1">
-      <w:start w:val="1"/>
-      <w:numFmt w:val="lowerLetter"/>
-      <w:lvlText w:val="%2."/>
-      <w:lvlJc w:val="left"/>
-      <w:pPr>
-        <w:ind w:left="1440" w:hanging="360"/>
-      </w:pPr>
-    </w:lvl>
-    <w:lvl w:ilvl="2" w:tplc="0807001B" w:tentative="1">
-      <w:start w:val="1"/>
-      <w:numFmt w:val="lowerRoman"/>
-      <w:lvlText w:val="%3."/>
-      <w:lvlJc w:val="right"/>
-      <w:pPr>
-        <w:ind w:left="2160" w:hanging="180"/>
-      </w:pPr>
-    </w:lvl>
-    <w:lvl w:ilvl="3" w:tplc="0807000F" w:tentative="1">
-      <w:start w:val="1"/>
-      <w:numFmt w:val="decimal"/>
-      <w:lvlText w:val="%4."/>
-      <w:lvlJc w:val="left"/>
-      <w:pPr>
-        <w:ind w:left="2880" w:hanging="360"/>
-      </w:pPr>
-    </w:lvl>
-    <w:lvl w:ilvl="4" w:tplc="08070019" w:tentative="1">
-      <w:start w:val="1"/>
-      <w:numFmt w:val="lowerLetter"/>
-      <w:lvlText w:val="%5."/>
-      <w:lvlJc w:val="left"/>
-      <w:pPr>
-        <w:ind w:left="3600" w:hanging="360"/>
-      </w:pPr>
-    </w:lvl>
-    <w:lvl w:ilvl="5" w:tplc="0807001B" w:tentative="1">
-      <w:start w:val="1"/>
-      <w:numFmt w:val="lowerRoman"/>
-      <w:lvlText w:val="%6."/>
-      <w:lvlJc w:val="right"/>
-      <w:pPr>
-        <w:ind w:left="4320" w:hanging="180"/>
-      </w:pPr>
-    </w:lvl>
-    <w:lvl w:ilvl="6" w:tplc="0807000F" w:tentative="1">
-      <w:start w:val="1"/>
-      <w:numFmt w:val="decimal"/>
-      <w:lvlText w:val="%7."/>
-      <w:lvlJc w:val="left"/>
-      <w:pPr>
-        <w:ind w:left="5040" w:hanging="360"/>
-      </w:pPr>
-    </w:lvl>
-    <w:lvl w:ilvl="7" w:tplc="08070019" w:tentative="1">
-      <w:start w:val="1"/>
-      <w:numFmt w:val="lowerLetter"/>
-      <w:lvlText w:val="%8."/>
-      <w:lvlJc w:val="left"/>
-      <w:pPr>
-        <w:ind w:left="5760" w:hanging="360"/>
-      </w:pPr>
-    </w:lvl>
-    <w:lvl w:ilvl="8" w:tplc="0807001B" w:tentative="1">
-      <w:start w:val="1"/>
-      <w:numFmt w:val="lowerRoman"/>
-      <w:lvlText w:val="%9."/>
-      <w:lvlJc w:val="right"/>
-      <w:pPr>
-        <w:ind w:left="6480" w:hanging="180"/>
-      </w:pPr>
-    </w:lvl>
-  </w:abstractNum>
-  <w:abstractNum w:abstractNumId="37" w15:restartNumberingAfterBreak="0">
+  <w:abstractNum w:abstractNumId="18" w15:restartNumberingAfterBreak="0">
     <w:nsid w:val="79FB6340"/>
     <w:multiLevelType w:val="hybridMultilevel"/>
     <w:tmpl w:val="3D0C57CE"/>
@@ -15129,103 +13293,13 @@
     </w:lvl>
   </w:abstractNum>
   <w:num w:numId="1" w16cid:durableId="1160971518">
-    <w:abstractNumId w:val="18"/>
+    <w:abstractNumId w:val="7"/>
   </w:num>
   <w:num w:numId="2" w16cid:durableId="587033493">
-    <w:abstractNumId w:val="2"/>
+    <w:abstractNumId w:val="0"/>
   </w:num>
-  <w:num w:numId="3" w16cid:durableId="2102725528">
-    <w:abstractNumId w:val="30"/>
-  </w:num>
-  <w:num w:numId="4" w16cid:durableId="408311589">
-    <w:abstractNumId w:val="10"/>
-  </w:num>
-  <w:num w:numId="5" w16cid:durableId="1205632175">
-    <w:abstractNumId w:val="36"/>
-  </w:num>
-  <w:num w:numId="6" w16cid:durableId="66659824">
-    <w:abstractNumId w:val="16"/>
-  </w:num>
-  <w:num w:numId="7" w16cid:durableId="1267738339">
-    <w:abstractNumId w:val="28"/>
-  </w:num>
-  <w:num w:numId="8" w16cid:durableId="1284119830">
-    <w:abstractNumId w:val="24"/>
-  </w:num>
-  <w:num w:numId="9" w16cid:durableId="1175919440">
-    <w:abstractNumId w:val="35"/>
-  </w:num>
-  <w:num w:numId="10" w16cid:durableId="1630160725">
-    <w:abstractNumId w:val="12"/>
-  </w:num>
-  <w:num w:numId="11" w16cid:durableId="1203442406">
-    <w:abstractNumId w:val="1"/>
-  </w:num>
-  <w:num w:numId="12" w16cid:durableId="85656597">
-    <w:abstractNumId w:val="1"/>
-  </w:num>
-  <w:num w:numId="13" w16cid:durableId="334578175">
-    <w:abstractNumId w:val="1"/>
-  </w:num>
-  <w:num w:numId="14" w16cid:durableId="1931229447">
-    <w:abstractNumId w:val="1"/>
-  </w:num>
-  <w:num w:numId="15" w16cid:durableId="528295227">
-    <w:abstractNumId w:val="1"/>
-  </w:num>
-  <w:num w:numId="16" w16cid:durableId="1066730727">
-    <w:abstractNumId w:val="1"/>
-  </w:num>
-  <w:num w:numId="17" w16cid:durableId="761537569">
-    <w:abstractNumId w:val="1"/>
-  </w:num>
-  <w:num w:numId="18" w16cid:durableId="988822373">
-    <w:abstractNumId w:val="1"/>
-  </w:num>
-  <w:num w:numId="19" w16cid:durableId="1909874485">
-    <w:abstractNumId w:val="1"/>
-  </w:num>
-  <w:num w:numId="20" w16cid:durableId="489250597">
-    <w:abstractNumId w:val="1"/>
-  </w:num>
-  <w:num w:numId="21" w16cid:durableId="189689768">
-    <w:abstractNumId w:val="1"/>
-  </w:num>
-  <w:num w:numId="22" w16cid:durableId="256790607">
-    <w:abstractNumId w:val="1"/>
-  </w:num>
-  <w:num w:numId="23" w16cid:durableId="1396468316">
-    <w:abstractNumId w:val="1"/>
-  </w:num>
-  <w:num w:numId="24" w16cid:durableId="1668704805">
-    <w:abstractNumId w:val="1"/>
-  </w:num>
-  <w:num w:numId="25" w16cid:durableId="198709993">
-    <w:abstractNumId w:val="1"/>
-  </w:num>
-  <w:num w:numId="26" w16cid:durableId="2040010467">
-    <w:abstractNumId w:val="16"/>
-  </w:num>
-  <w:num w:numId="27" w16cid:durableId="1400983140">
-    <w:abstractNumId w:val="16"/>
-  </w:num>
-  <w:num w:numId="28" w16cid:durableId="1463498739">
-    <w:abstractNumId w:val="16"/>
-  </w:num>
-  <w:num w:numId="29" w16cid:durableId="90855359">
-    <w:abstractNumId w:val="16"/>
-  </w:num>
-  <w:num w:numId="30" w16cid:durableId="1286036697">
-    <w:abstractNumId w:val="16"/>
-  </w:num>
-  <w:num w:numId="31" w16cid:durableId="1257715062">
-    <w:abstractNumId w:val="16"/>
-  </w:num>
-  <w:num w:numId="32" w16cid:durableId="1595825414">
-    <w:abstractNumId w:val="16"/>
-  </w:num>
-  <w:num w:numId="33" w16cid:durableId="637103759">
-    <w:abstractNumId w:val="12"/>
+  <w:num w:numId="3" w16cid:durableId="637103759">
+    <w:abstractNumId w:val="3"/>
     <w:lvlOverride w:ilvl="0">
       <w:startOverride w:val="10"/>
     </w:lvlOverride>
@@ -15254,74 +13328,53 @@
       <w:startOverride w:val="1"/>
     </w:lvlOverride>
   </w:num>
-  <w:num w:numId="34" w16cid:durableId="585387734">
-    <w:abstractNumId w:val="36"/>
+  <w:num w:numId="4" w16cid:durableId="993143293">
+    <w:abstractNumId w:val="1"/>
   </w:num>
-  <w:num w:numId="35" w16cid:durableId="1173377504">
-    <w:abstractNumId w:val="36"/>
+  <w:num w:numId="5" w16cid:durableId="1604611779">
+    <w:abstractNumId w:val="16"/>
   </w:num>
-  <w:num w:numId="36" w16cid:durableId="592053850">
-    <w:abstractNumId w:val="36"/>
+  <w:num w:numId="6" w16cid:durableId="1700475242">
+    <w:abstractNumId w:val="2"/>
   </w:num>
-  <w:num w:numId="37" w16cid:durableId="739986261">
-    <w:abstractNumId w:val="33"/>
+  <w:num w:numId="7" w16cid:durableId="1752660477">
+    <w:abstractNumId w:val="6"/>
   </w:num>
-  <w:num w:numId="38" w16cid:durableId="1398551481">
+  <w:num w:numId="8" w16cid:durableId="1505245732">
+    <w:abstractNumId w:val="8"/>
+  </w:num>
+  <w:num w:numId="9" w16cid:durableId="1100680541">
+    <w:abstractNumId w:val="14"/>
+  </w:num>
+  <w:num w:numId="10" w16cid:durableId="2097700178">
+    <w:abstractNumId w:val="10"/>
+  </w:num>
+  <w:num w:numId="11" w16cid:durableId="1254971269">
+    <w:abstractNumId w:val="5"/>
+  </w:num>
+  <w:num w:numId="12" w16cid:durableId="1241134758">
+    <w:abstractNumId w:val="11"/>
+  </w:num>
+  <w:num w:numId="13" w16cid:durableId="1004436154">
+    <w:abstractNumId w:val="18"/>
+  </w:num>
+  <w:num w:numId="14" w16cid:durableId="2004778405">
     <w:abstractNumId w:val="15"/>
   </w:num>
-  <w:num w:numId="39" w16cid:durableId="1972205441">
-    <w:abstractNumId w:val="0"/>
+  <w:num w:numId="15" w16cid:durableId="1784499588">
+    <w:abstractNumId w:val="4"/>
   </w:num>
-  <w:num w:numId="40" w16cid:durableId="1954356964">
-    <w:abstractNumId w:val="34"/>
+  <w:num w:numId="16" w16cid:durableId="370880887">
+    <w:abstractNumId w:val="17"/>
   </w:num>
-  <w:num w:numId="41" w16cid:durableId="993143293">
-    <w:abstractNumId w:val="5"/>
-  </w:num>
-  <w:num w:numId="42" w16cid:durableId="1604611779">
-    <w:abstractNumId w:val="31"/>
-  </w:num>
-  <w:num w:numId="43" w16cid:durableId="1700475242">
+  <w:num w:numId="17" w16cid:durableId="1750421761">
     <w:abstractNumId w:val="9"/>
   </w:num>
-  <w:num w:numId="44" w16cid:durableId="1752660477">
-    <w:abstractNumId w:val="17"/>
-  </w:num>
-  <w:num w:numId="45" w16cid:durableId="1505245732">
-    <w:abstractNumId w:val="19"/>
-  </w:num>
-  <w:num w:numId="46" w16cid:durableId="1100680541">
-    <w:abstractNumId w:val="27"/>
-  </w:num>
-  <w:num w:numId="47" w16cid:durableId="2097700178">
-    <w:abstractNumId w:val="21"/>
-  </w:num>
-  <w:num w:numId="48" w16cid:durableId="1254971269">
-    <w:abstractNumId w:val="14"/>
-  </w:num>
-  <w:num w:numId="49" w16cid:durableId="1241134758">
-    <w:abstractNumId w:val="22"/>
-  </w:num>
-  <w:num w:numId="50" w16cid:durableId="1004436154">
-    <w:abstractNumId w:val="37"/>
-  </w:num>
-  <w:num w:numId="51" w16cid:durableId="2004778405">
-    <w:abstractNumId w:val="29"/>
-  </w:num>
-  <w:num w:numId="52" w16cid:durableId="1784499588">
+  <w:num w:numId="18" w16cid:durableId="1772966474">
     <w:abstractNumId w:val="13"/>
   </w:num>
-  <w:num w:numId="53" w16cid:durableId="370880887">
-    <w:abstractNumId w:val="32"/>
-  </w:num>
-  <w:num w:numId="54" w16cid:durableId="1750421761">
-    <w:abstractNumId w:val="20"/>
-  </w:num>
-  <w:num w:numId="55" w16cid:durableId="1772966474">
-    <w:abstractNumId w:val="26"/>
-  </w:num>
-  <w:num w:numId="56" w16cid:durableId="1975016665">
-    <w:abstractNumId w:val="27"/>
+  <w:num w:numId="19" w16cid:durableId="1975016665">
+    <w:abstractNumId w:val="14"/>
     <w:lvlOverride w:ilvl="0">
       <w:lvl w:ilvl="0">
         <w:start w:val="1"/>
@@ -15339,91 +13392,10 @@
       </w:lvl>
     </w:lvlOverride>
   </w:num>
-  <w:num w:numId="57" w16cid:durableId="1656564036">
-    <w:abstractNumId w:val="8"/>
+  <w:num w:numId="20" w16cid:durableId="162741710">
+    <w:abstractNumId w:val="12"/>
   </w:num>
-  <w:num w:numId="58" w16cid:durableId="1430202964">
-    <w:abstractNumId w:val="7"/>
-  </w:num>
-  <w:num w:numId="59" w16cid:durableId="775755186">
-    <w:abstractNumId w:val="23"/>
-  </w:num>
-  <w:num w:numId="60" w16cid:durableId="373308556">
-    <w:abstractNumId w:val="4"/>
-  </w:num>
-  <w:num w:numId="61" w16cid:durableId="1725979521">
-    <w:abstractNumId w:val="3"/>
-  </w:num>
-  <w:num w:numId="62" w16cid:durableId="658198397">
-    <w:abstractNumId w:val="11"/>
-  </w:num>
-  <w:num w:numId="63" w16cid:durableId="568268560">
-    <w:abstractNumId w:val="6"/>
-  </w:num>
-  <w:num w:numId="64" w16cid:durableId="1717703896">
-    <w:abstractNumId w:val="12"/>
-    <w:lvlOverride w:ilvl="0">
-      <w:startOverride w:val="10"/>
-    </w:lvlOverride>
-    <w:lvlOverride w:ilvl="1">
-      <w:startOverride w:val="2"/>
-    </w:lvlOverride>
-    <w:lvlOverride w:ilvl="2">
-      <w:startOverride w:val="1"/>
-    </w:lvlOverride>
-    <w:lvlOverride w:ilvl="3">
-      <w:startOverride w:val="1"/>
-    </w:lvlOverride>
-    <w:lvlOverride w:ilvl="4">
-      <w:startOverride w:val="1"/>
-    </w:lvlOverride>
-    <w:lvlOverride w:ilvl="5">
-      <w:startOverride w:val="1"/>
-    </w:lvlOverride>
-    <w:lvlOverride w:ilvl="6">
-      <w:startOverride w:val="1"/>
-    </w:lvlOverride>
-    <w:lvlOverride w:ilvl="7">
-      <w:startOverride w:val="1"/>
-    </w:lvlOverride>
-    <w:lvlOverride w:ilvl="8">
-      <w:startOverride w:val="1"/>
-    </w:lvlOverride>
-  </w:num>
-  <w:num w:numId="65" w16cid:durableId="2083215119">
-    <w:abstractNumId w:val="12"/>
-    <w:lvlOverride w:ilvl="0">
-      <w:startOverride w:val="10"/>
-    </w:lvlOverride>
-    <w:lvlOverride w:ilvl="1">
-      <w:startOverride w:val="2"/>
-    </w:lvlOverride>
-    <w:lvlOverride w:ilvl="2">
-      <w:startOverride w:val="1"/>
-    </w:lvlOverride>
-    <w:lvlOverride w:ilvl="3">
-      <w:startOverride w:val="1"/>
-    </w:lvlOverride>
-    <w:lvlOverride w:ilvl="4">
-      <w:startOverride w:val="1"/>
-    </w:lvlOverride>
-    <w:lvlOverride w:ilvl="5">
-      <w:startOverride w:val="1"/>
-    </w:lvlOverride>
-    <w:lvlOverride w:ilvl="6">
-      <w:startOverride w:val="1"/>
-    </w:lvlOverride>
-    <w:lvlOverride w:ilvl="7">
-      <w:startOverride w:val="1"/>
-    </w:lvlOverride>
-    <w:lvlOverride w:ilvl="8">
-      <w:startOverride w:val="1"/>
-    </w:lvlOverride>
-  </w:num>
-  <w:num w:numId="66" w16cid:durableId="162741710">
-    <w:abstractNumId w:val="25"/>
-  </w:num>
-  <w:numIdMacAtCleanup w:val="10"/>
+  <w:numIdMacAtCleanup w:val="20"/>
 </w:numbering>
 </file>
 
@@ -15769,7 +13741,7 @@
     <w:pPr>
       <w:keepNext/>
       <w:numPr>
-        <w:numId w:val="33"/>
+        <w:numId w:val="3"/>
       </w:numPr>
       <w:spacing w:line="340" w:lineRule="exact"/>
       <w:outlineLvl w:val="0"/>
@@ -15794,7 +13766,7 @@
       <w:keepNext/>
       <w:numPr>
         <w:ilvl w:val="1"/>
-        <w:numId w:val="33"/>
+        <w:numId w:val="3"/>
       </w:numPr>
       <w:spacing w:line="340" w:lineRule="exact"/>
       <w:outlineLvl w:val="1"/>
@@ -15820,7 +13792,7 @@
       <w:keepNext/>
       <w:numPr>
         <w:ilvl w:val="2"/>
-        <w:numId w:val="33"/>
+        <w:numId w:val="3"/>
       </w:numPr>
       <w:outlineLvl w:val="2"/>
     </w:pPr>
@@ -15844,7 +13816,7 @@
       <w:keepLines/>
       <w:numPr>
         <w:ilvl w:val="3"/>
-        <w:numId w:val="33"/>
+        <w:numId w:val="3"/>
       </w:numPr>
       <w:tabs>
         <w:tab w:val="num" w:pos="360"/>
@@ -15872,7 +13844,7 @@
       <w:keepLines/>
       <w:numPr>
         <w:ilvl w:val="4"/>
-        <w:numId w:val="33"/>
+        <w:numId w:val="3"/>
       </w:numPr>
       <w:tabs>
         <w:tab w:val="num" w:pos="360"/>
@@ -15898,7 +13870,7 @@
       <w:keepLines/>
       <w:numPr>
         <w:ilvl w:val="5"/>
-        <w:numId w:val="33"/>
+        <w:numId w:val="3"/>
       </w:numPr>
       <w:tabs>
         <w:tab w:val="num" w:pos="360"/>
@@ -15924,7 +13896,7 @@
       <w:keepLines/>
       <w:numPr>
         <w:ilvl w:val="6"/>
-        <w:numId w:val="33"/>
+        <w:numId w:val="3"/>
       </w:numPr>
       <w:tabs>
         <w:tab w:val="num" w:pos="360"/>
@@ -15952,7 +13924,7 @@
       <w:keepLines/>
       <w:numPr>
         <w:ilvl w:val="7"/>
-        <w:numId w:val="33"/>
+        <w:numId w:val="3"/>
       </w:numPr>
       <w:tabs>
         <w:tab w:val="num" w:pos="360"/>
@@ -15980,7 +13952,7 @@
       <w:keepLines/>
       <w:numPr>
         <w:ilvl w:val="8"/>
-        <w:numId w:val="33"/>
+        <w:numId w:val="3"/>
       </w:numPr>
       <w:tabs>
         <w:tab w:val="num" w:pos="360"/>
@@ -17460,7 +15432,7 @@
     <w:rsid w:val="00CF5E78"/>
     <w:pPr>
       <w:numPr>
-        <w:numId w:val="55"/>
+        <w:numId w:val="18"/>
       </w:numPr>
       <w:spacing w:after="240"/>
       <w:ind w:left="0" w:firstLine="0"/>
@@ -17473,7 +15445,7 @@
     <w:rsid w:val="00CF5E78"/>
     <w:pPr>
       <w:numPr>
-        <w:numId w:val="54"/>
+        <w:numId w:val="17"/>
       </w:numPr>
       <w:spacing w:after="200"/>
       <w:ind w:left="0" w:firstLine="0"/>
@@ -17486,7 +15458,7 @@
     <w:rsid w:val="00CF5E78"/>
     <w:pPr>
       <w:numPr>
-        <w:numId w:val="49"/>
+        <w:numId w:val="12"/>
       </w:numPr>
       <w:spacing w:after="240"/>
       <w:ind w:left="0" w:firstLine="0"/>
@@ -17648,7 +15620,7 @@
     <w:rsid w:val="00CF5E78"/>
     <w:pPr>
       <w:numPr>
-        <w:numId w:val="50"/>
+        <w:numId w:val="13"/>
       </w:numPr>
       <w:ind w:left="0" w:firstLine="0"/>
     </w:pPr>
@@ -17660,7 +15632,7 @@
     <w:rsid w:val="00CF5E78"/>
     <w:pPr>
       <w:numPr>
-        <w:numId w:val="51"/>
+        <w:numId w:val="14"/>
       </w:numPr>
       <w:ind w:left="0" w:firstLine="0"/>
     </w:pPr>
@@ -17687,7 +15659,7 @@
     <w:pPr>
       <w:widowControl w:val="0"/>
       <w:numPr>
-        <w:numId w:val="53"/>
+        <w:numId w:val="16"/>
       </w:numPr>
       <w:spacing w:line="260" w:lineRule="atLeast"/>
       <w:ind w:left="0" w:firstLine="0"/>
@@ -17903,7 +15875,7 @@
     <w:rsid w:val="00CF5E78"/>
     <w:pPr>
       <w:numPr>
-        <w:numId w:val="42"/>
+        <w:numId w:val="5"/>
       </w:numPr>
     </w:pPr>
   </w:style>
@@ -17933,7 +15905,7 @@
     <w:rsid w:val="00CF5E78"/>
     <w:pPr>
       <w:numPr>
-        <w:numId w:val="43"/>
+        <w:numId w:val="6"/>
       </w:numPr>
     </w:pPr>
   </w:style>
@@ -17954,7 +15926,7 @@
     <w:rsid w:val="00CF5E78"/>
     <w:pPr>
       <w:numPr>
-        <w:numId w:val="44"/>
+        <w:numId w:val="7"/>
       </w:numPr>
     </w:pPr>
   </w:style>
@@ -17964,7 +15936,7 @@
     <w:rsid w:val="00CF5E78"/>
     <w:pPr>
       <w:numPr>
-        <w:numId w:val="45"/>
+        <w:numId w:val="8"/>
       </w:numPr>
     </w:pPr>
   </w:style>
@@ -17974,7 +15946,7 @@
     <w:rsid w:val="00CF5E78"/>
     <w:pPr>
       <w:numPr>
-        <w:numId w:val="46"/>
+        <w:numId w:val="9"/>
       </w:numPr>
     </w:pPr>
   </w:style>
@@ -17984,7 +15956,7 @@
     <w:rsid w:val="00CF5E78"/>
     <w:pPr>
       <w:numPr>
-        <w:numId w:val="47"/>
+        <w:numId w:val="10"/>
       </w:numPr>
     </w:pPr>
   </w:style>
@@ -18062,7 +16034,7 @@
     <w:rsid w:val="00CF5E78"/>
     <w:pPr>
       <w:numPr>
-        <w:numId w:val="48"/>
+        <w:numId w:val="11"/>
       </w:numPr>
     </w:pPr>
   </w:style>
@@ -18418,7 +16390,7 @@
     <w:rsid w:val="00CF5E78"/>
     <w:pPr>
       <w:numPr>
-        <w:numId w:val="47"/>
+        <w:numId w:val="10"/>
       </w:numPr>
       <w:ind w:left="0" w:firstLine="0"/>
       <w:contextualSpacing/>
@@ -18433,7 +16405,7 @@
     <w:rsid w:val="00CF5E78"/>
     <w:pPr>
       <w:numPr>
-        <w:numId w:val="43"/>
+        <w:numId w:val="6"/>
       </w:numPr>
       <w:ind w:left="0" w:firstLine="0"/>
       <w:contextualSpacing/>
@@ -18447,7 +16419,7 @@
     <w:rsid w:val="00CF5E78"/>
     <w:pPr>
       <w:numPr>
-        <w:numId w:val="42"/>
+        <w:numId w:val="5"/>
       </w:numPr>
       <w:ind w:left="0" w:firstLine="0"/>
       <w:contextualSpacing/>
@@ -18462,7 +16434,7 @@
     <w:rsid w:val="00CF5E78"/>
     <w:pPr>
       <w:numPr>
-        <w:numId w:val="48"/>
+        <w:numId w:val="11"/>
       </w:numPr>
       <w:ind w:left="0" w:firstLine="0"/>
       <w:contextualSpacing/>
@@ -18476,7 +16448,7 @@
     <w:rsid w:val="00CF5E78"/>
     <w:pPr>
       <w:numPr>
-        <w:numId w:val="44"/>
+        <w:numId w:val="7"/>
       </w:numPr>
       <w:ind w:left="0" w:firstLine="0"/>
     </w:pPr>
@@ -18492,7 +16464,7 @@
     <w:rsid w:val="00CF5E78"/>
     <w:pPr>
       <w:numPr>
-        <w:numId w:val="45"/>
+        <w:numId w:val="8"/>
       </w:numPr>
       <w:ind w:left="0" w:firstLine="0"/>
       <w:contextualSpacing/>
@@ -18506,7 +16478,7 @@
     <w:rsid w:val="00CF5E78"/>
     <w:pPr>
       <w:numPr>
-        <w:numId w:val="52"/>
+        <w:numId w:val="15"/>
       </w:numPr>
       <w:ind w:left="0" w:firstLine="0"/>
     </w:pPr>

</xml_diff>